<commit_message>
docs: record traceable references and current tool disclosures
</commit_message>
<xml_diff>
--- a/documents/參考資料.docx
+++ b/documents/參考資料.docx
@@ -134,7 +134,7 @@
                 <w:b/>
                 <w:sz w:val="20"/>
               </w:rPr>
-              <w:t>用途</w:t>
+              <w:t>用途與來源資訊</w:t>
             </w:r>
             <w:proofErr w:type="spellEnd"/>
           </w:p>
@@ -191,7 +191,7 @@
               <w:rPr>
                 <w:sz w:val="20"/>
               </w:rPr>
-              <w:t>官方文件</w:t>
+              <w:t>Security</w:t>
             </w:r>
             <w:proofErr w:type="spellEnd"/>
           </w:p>
@@ -211,7 +211,7 @@
               <w:rPr>
                 <w:sz w:val="20"/>
               </w:rPr>
-              <w:t>後端</w:t>
+              <w:t>身分驗證與權限設計；https://fastapi.tiangolo.com/tutorial/security/；專案 requirements.txt 指定 Fast</w:t>
             </w:r>
             <w:r>
               <w:rPr>
@@ -223,19 +223,17 @@
               <w:rPr>
                 <w:sz w:val="20"/>
               </w:rPr>
-              <w:t>框架、路由與</w:t>
-            </w:r>
-            <w:r>
-              <w:rPr>
-                <w:sz w:val="20"/>
-              </w:rPr>
-              <w:t>OpenAPI</w:t>
-            </w:r>
-            <w:r>
-              <w:rPr>
-                <w:sz w:val="20"/>
-              </w:rPr>
-              <w:t>文件</w:t>
+              <w:t xml:space="preserve"> 0.135.3；官方頁面查閱日期 2026-10-03</w:t>
+            </w:r>
+            <w:r>
+              <w:rPr>
+                <w:sz w:val="20"/>
+              </w:rPr>
+            </w:r>
+            <w:r>
+              <w:rPr>
+                <w:sz w:val="20"/>
+              </w:rPr>
             </w:r>
             <w:proofErr w:type="spellEnd"/>
             <w:r>
@@ -290,7 +288,7 @@
               <w:rPr>
                 <w:sz w:val="20"/>
               </w:rPr>
-              <w:t>文件</w:t>
+              <w:t>通知權限</w:t>
             </w:r>
             <w:proofErr w:type="spellEnd"/>
           </w:p>
@@ -310,7 +308,7 @@
               <w:rPr>
                 <w:sz w:val="20"/>
               </w:rPr>
-              <w:t>Activity</w:t>
+              <w:t>Android 通知權限參考；https://developer.android.com/develop/ui/compose/notifications/notification-permission；原 Views URL 重新導向此頁；專案 minSdk 26</w:t>
             </w:r>
             <w:r>
               <w:rPr>
@@ -322,25 +320,23 @@
               <w:rPr>
                 <w:sz w:val="20"/>
               </w:rPr>
-              <w:t>Intent</w:t>
-            </w:r>
-            <w:r>
-              <w:rPr>
-                <w:sz w:val="20"/>
-              </w:rPr>
-              <w:t>、權限與</w:t>
-            </w:r>
-            <w:r>
-              <w:rPr>
-                <w:sz w:val="20"/>
-              </w:rPr>
-              <w:t>UI</w:t>
-            </w:r>
-            <w:r>
-              <w:rPr>
-                <w:sz w:val="20"/>
-              </w:rPr>
-              <w:t>元件</w:t>
+              <w:t>compileSdk／target</w:t>
+            </w:r>
+            <w:r>
+              <w:rPr>
+                <w:sz w:val="20"/>
+              </w:rPr>
+              <w:t>Sdk 36，通知實機驗證未完成；查閱日期 2026-10-03</w:t>
+            </w:r>
+            <w:r>
+              <w:rPr>
+                <w:sz w:val="20"/>
+              </w:rPr>
+            </w:r>
+            <w:r>
+              <w:rPr>
+                <w:sz w:val="20"/>
+              </w:rPr>
             </w:r>
             <w:proofErr w:type="spellEnd"/>
             <w:r>
@@ -395,7 +391,7 @@
               <w:rPr>
                 <w:sz w:val="20"/>
               </w:rPr>
-              <w:t>文件</w:t>
+              <w:t>Embeddings</w:t>
             </w:r>
             <w:proofErr w:type="spellEnd"/>
           </w:p>
@@ -418,7 +414,7 @@
                 <w:sz w:val="20"/>
                 <w:lang w:eastAsia="zh-TW"/>
               </w:rPr>
-              <w:t>多模態影像診斷與文字生成。</w:t>
+              <w:t>向量建庫與檢索；https://ai.google.dev/gemini-api/docs/embeddings；requirements.txt 指定 google-genai 1.72.0；建庫設定 gemini-embedding-001、768 維；查閱日期 2026-10-03。</w:t>
             </w:r>
           </w:p>
         </w:tc>
@@ -466,7 +462,7 @@
               <w:rPr>
                 <w:sz w:val="20"/>
               </w:rPr>
-              <w:t>文件</w:t>
+              <w:t>8.0 CREATE TABLE</w:t>
             </w:r>
             <w:proofErr w:type="spellEnd"/>
           </w:p>
@@ -489,7 +485,7 @@
                 <w:sz w:val="20"/>
                 <w:lang w:eastAsia="zh-TW"/>
               </w:rPr>
-              <w:t>資料庫設計、約束與查詢。</w:t>
+              <w:t>資料表與限制語法；https://dev.mysql.com/doc/refman/8.0/en/create-table.html；參考文件為 MySQL 8.0，不代表已驗證部署版本；查閱日期 2026-10-03。</w:t>
             </w:r>
           </w:p>
         </w:tc>
@@ -538,14 +534,14 @@
               <w:rPr>
                 <w:sz w:val="20"/>
               </w:rPr>
-              <w:t xml:space="preserve"> / Alembic </w:t>
+              <w:t xml:space="preserve"> 2.0 Basic </w:t>
             </w:r>
             <w:proofErr w:type="spellStart"/>
             <w:r>
               <w:rPr>
                 <w:sz w:val="20"/>
               </w:rPr>
-              <w:t>文件</w:t>
+              <w:t>Relationship Patterns</w:t>
             </w:r>
             <w:proofErr w:type="spellEnd"/>
           </w:p>
@@ -575,7 +571,7 @@
                 <w:sz w:val="20"/>
                 <w:lang w:eastAsia="zh-TW"/>
               </w:rPr>
-              <w:t>模型與資料庫遷移。</w:t>
+              <w:t xml:space="preserve"> 關聯參考；https://docs.sqlalchemy.org/en/20/orm/basic_relationships.html；requirements.txt 指定 SQLAlchemy 2.0.49；查閱日期 2026-10-03。</w:t>
             </w:r>
           </w:p>
         </w:tc>
@@ -620,21 +616,20 @@
                 <w:sz w:val="20"/>
                 <w:lang w:eastAsia="zh-TW"/>
               </w:rPr>
-              <w:t>專案程式碼與</w:t>
-            </w:r>
-            <w:r>
-              <w:rPr>
-                <w:sz w:val="20"/>
-                <w:lang w:eastAsia="zh-TW"/>
-              </w:rPr>
-              <w:t>GitHub</w:t>
-            </w:r>
-            <w:r>
-              <w:rPr>
-                <w:sz w:val="20"/>
-                <w:lang w:eastAsia="zh-TW"/>
-              </w:rPr>
-              <w:t>提交紀錄</w:t>
+              <w:t>Alemb</w:t>
+            </w:r>
+            <w:r>
+              <w:rPr>
+                <w:sz w:val="20"/>
+                <w:lang w:eastAsia="zh-TW"/>
+              </w:rPr>
+              <w:t>ic Tutorial</w:t>
+            </w:r>
+            <w:r>
+              <w:rPr>
+                <w:sz w:val="20"/>
+                <w:lang w:eastAsia="zh-TW"/>
+              </w:rPr>
             </w:r>
           </w:p>
         </w:tc>
@@ -656,7 +651,405 @@
                 <w:sz w:val="20"/>
                 <w:lang w:eastAsia="zh-TW"/>
               </w:rPr>
-              <w:t>系統元件、功能與開發歷程依據。</w:t>
+              <w:t>遷移流程參考；https://alembic.sqlalchemy.org/en/latest/tutorial.html；查閱頁面當時為 1.20 系列，專案 requirements.txt 指定 1.18.4；文件頁面版本不等同專案安裝版本；查閱日期 2026-10-03。</w:t>
+            </w:r>
+          </w:p>
+        </w:tc>
+      </w:tr>
+      <w:tr>
+        <w:trPr>
+          <w:jc w:val="center"/>
+        </w:trPr>
+        <w:tc>
+          <w:tcPr>
+            <w:tcW w:w="1020" w:type="dxa"/>
+            <w:vAlign w:val="center"/>
+          </w:tcPr>
+          <w:p>
+            <w:pPr>
+              <w:ind w:left="280" w:right="280"/>
+              <w:jc w:val="center"/>
+            </w:pPr>
+            <w:r>
+              <w:rPr>
+                <w:sz w:val="20"/>
+              </w:rPr>
+              <w:t>7</w:t>
+            </w:r>
+          </w:p>
+        </w:tc>
+        <w:tc>
+          <w:tcPr>
+            <w:tcW w:w="3288" w:type="dxa"/>
+            <w:vAlign w:val="center"/>
+          </w:tcPr>
+          <w:p>
+            <w:pPr>
+              <w:ind w:left="280" w:right="280"/>
+              <w:jc w:val="center"/>
+              <w:rPr>
+                <w:lang w:eastAsia="zh-TW"/>
+              </w:rPr>
+            </w:pPr>
+            <w:r>
+              <w:rPr>
+                <w:sz w:val="20"/>
+                <w:lang w:eastAsia="zh-TW"/>
+              </w:rPr>
+              <w:t>農業部重要農業害蟲診斷圖鑑 API</w:t>
+            </w:r>
+            <w:r>
+              <w:rPr>
+                <w:sz w:val="20"/>
+                <w:lang w:eastAsia="zh-TW"/>
+              </w:rPr>
+            </w:r>
+            <w:r>
+              <w:rPr>
+                <w:sz w:val="20"/>
+                <w:lang w:eastAsia="zh-TW"/>
+              </w:rPr>
+            </w:r>
+          </w:p>
+        </w:tc>
+        <w:tc>
+          <w:tcPr>
+            <w:tcW w:w="5159" w:type="dxa"/>
+            <w:vAlign w:val="center"/>
+          </w:tcPr>
+          <w:p>
+            <w:pPr>
+              <w:ind w:left="280" w:right="280"/>
+              <w:jc w:val="center"/>
+              <w:rPr>
+                <w:lang w:eastAsia="zh-TW"/>
+              </w:rPr>
+            </w:pPr>
+            <w:r>
+              <w:rPr>
+                <w:sz w:val="20"/>
+                <w:lang w:eastAsia="zh-TW"/>
+              </w:rPr>
+              <w:t>專案 update_reference_data.py 的來源設定；https://data.moa.gov.tw/api/v1/ImportantAgriculturalPestDiagnosticsType/；2026-10-03 查核工具回傳內部錯誤，未能確認成功取得；不是原始案例內容審查或當日資料更新證據。</w:t>
+            </w:r>
+          </w:p>
+        </w:tc>
+      </w:tr>
+      <w:tr>
+        <w:trPr>
+          <w:jc w:val="center"/>
+        </w:trPr>
+        <w:tc>
+          <w:tcPr>
+            <w:tcW w:w="1020" w:type="dxa"/>
+            <w:vAlign w:val="center"/>
+          </w:tcPr>
+          <w:p>
+            <w:pPr>
+              <w:ind w:left="280" w:right="280"/>
+              <w:jc w:val="center"/>
+            </w:pPr>
+            <w:r>
+              <w:rPr>
+                <w:sz w:val="20"/>
+              </w:rPr>
+              <w:t>8</w:t>
+            </w:r>
+          </w:p>
+        </w:tc>
+        <w:tc>
+          <w:tcPr>
+            <w:tcW w:w="3288" w:type="dxa"/>
+            <w:vAlign w:val="center"/>
+          </w:tcPr>
+          <w:p>
+            <w:pPr>
+              <w:ind w:left="280" w:right="280"/>
+              <w:jc w:val="center"/>
+              <w:rPr>
+                <w:lang w:eastAsia="zh-TW"/>
+              </w:rPr>
+            </w:pPr>
+            <w:r>
+              <w:rPr>
+                <w:sz w:val="20"/>
+                <w:lang w:eastAsia="zh-TW"/>
+              </w:rPr>
+              <w:t>農業部樹木病蟲害診斷案例 API</w:t>
+            </w:r>
+            <w:r>
+              <w:rPr>
+                <w:sz w:val="20"/>
+                <w:lang w:eastAsia="zh-TW"/>
+              </w:rPr>
+            </w:r>
+            <w:r>
+              <w:rPr>
+                <w:sz w:val="20"/>
+                <w:lang w:eastAsia="zh-TW"/>
+              </w:rPr>
+            </w:r>
+          </w:p>
+        </w:tc>
+        <w:tc>
+          <w:tcPr>
+            <w:tcW w:w="5159" w:type="dxa"/>
+            <w:vAlign w:val="center"/>
+          </w:tcPr>
+          <w:p>
+            <w:pPr>
+              <w:ind w:left="280" w:right="280"/>
+              <w:jc w:val="center"/>
+              <w:rPr>
+                <w:lang w:eastAsia="zh-TW"/>
+              </w:rPr>
+            </w:pPr>
+            <w:r>
+              <w:rPr>
+                <w:sz w:val="20"/>
+                <w:lang w:eastAsia="zh-TW"/>
+              </w:rPr>
+              <w:t>專案 update_reference_data.py 的來源設定；https://data.moa.gov.tw/api/v1/TreePestInfoType/；2026-10-03 查核工具回傳內部錯誤，未能確認成功取得；來源網址不必然是個別案例原始頁面。</w:t>
+            </w:r>
+          </w:p>
+        </w:tc>
+      </w:tr>
+      <w:tr>
+        <w:trPr>
+          <w:jc w:val="center"/>
+        </w:trPr>
+        <w:tc>
+          <w:tcPr>
+            <w:tcW w:w="1020" w:type="dxa"/>
+            <w:vAlign w:val="center"/>
+          </w:tcPr>
+          <w:p>
+            <w:pPr>
+              <w:ind w:left="280" w:right="280"/>
+              <w:jc w:val="center"/>
+            </w:pPr>
+            <w:r>
+              <w:rPr>
+                <w:sz w:val="20"/>
+              </w:rPr>
+              <w:t>9</w:t>
+            </w:r>
+          </w:p>
+        </w:tc>
+        <w:tc>
+          <w:tcPr>
+            <w:tcW w:w="3288" w:type="dxa"/>
+            <w:vAlign w:val="center"/>
+          </w:tcPr>
+          <w:p>
+            <w:pPr>
+              <w:ind w:left="280" w:right="280"/>
+              <w:jc w:val="center"/>
+              <w:rPr>
+                <w:lang w:eastAsia="zh-TW"/>
+              </w:rPr>
+            </w:pPr>
+            <w:r>
+              <w:rPr>
+                <w:sz w:val="20"/>
+                <w:lang w:eastAsia="zh-TW"/>
+              </w:rPr>
+              <w:t>專案原始碼與</w:t>
+            </w:r>
+            <w:r>
+              <w:rPr>
+                <w:sz w:val="20"/>
+                <w:lang w:eastAsia="zh-TW"/>
+              </w:rPr>
+              <w:t>離線測試</w:t>
+            </w:r>
+            <w:r>
+              <w:rPr>
+                <w:sz w:val="20"/>
+                <w:lang w:eastAsia="zh-TW"/>
+              </w:rPr>
+            </w:r>
+          </w:p>
+        </w:tc>
+        <w:tc>
+          <w:tcPr>
+            <w:tcW w:w="5159" w:type="dxa"/>
+            <w:vAlign w:val="center"/>
+          </w:tcPr>
+          <w:p>
+            <w:pPr>
+              <w:ind w:left="280" w:right="280"/>
+              <w:jc w:val="center"/>
+              <w:rPr>
+                <w:lang w:eastAsia="zh-TW"/>
+              </w:rPr>
+            </w:pPr>
+            <w:r>
+              <w:rPr>
+                <w:sz w:val="20"/>
+                <w:lang w:eastAsia="zh-TW"/>
+              </w:rPr>
+              <w:t>https://github.com/11436022/plant；後端離線套件已執行通過，測試版本、數量、耗時及發佈版本依最終報告核對；未驗證 live Gemini、MySQL 或 SMTP。</w:t>
+            </w:r>
+          </w:p>
+        </w:tc>
+      </w:tr>
+      <w:tr>
+        <w:trPr>
+          <w:jc w:val="center"/>
+        </w:trPr>
+        <w:tc>
+          <w:tcPr>
+            <w:tcW w:w="1020" w:type="dxa"/>
+            <w:vAlign w:val="center"/>
+          </w:tcPr>
+          <w:p>
+            <w:pPr>
+              <w:ind w:left="280" w:right="280"/>
+              <w:jc w:val="center"/>
+            </w:pPr>
+            <w:r>
+              <w:rPr>
+                <w:sz w:val="20"/>
+              </w:rPr>
+              <w:t>10</w:t>
+            </w:r>
+          </w:p>
+        </w:tc>
+        <w:tc>
+          <w:tcPr>
+            <w:tcW w:w="3288" w:type="dxa"/>
+            <w:vAlign w:val="center"/>
+          </w:tcPr>
+          <w:p>
+            <w:pPr>
+              <w:ind w:left="280" w:right="280"/>
+              <w:jc w:val="center"/>
+              <w:rPr>
+                <w:lang w:eastAsia="zh-TW"/>
+              </w:rPr>
+            </w:pPr>
+            <w:r>
+              <w:rPr>
+                <w:sz w:val="20"/>
+                <w:lang w:eastAsia="zh-TW"/>
+              </w:rPr>
+              <w:t>RAG 農業資料與</w:t>
+            </w:r>
+            <w:r>
+              <w:rPr>
+                <w:sz w:val="20"/>
+                <w:lang w:eastAsia="zh-TW"/>
+              </w:rPr>
+              <w:t>建庫清單</w:t>
+            </w:r>
+            <w:r>
+              <w:rPr>
+                <w:sz w:val="20"/>
+                <w:lang w:eastAsia="zh-TW"/>
+              </w:rPr>
+            </w:r>
+          </w:p>
+        </w:tc>
+        <w:tc>
+          <w:tcPr>
+            <w:tcW w:w="5159" w:type="dxa"/>
+            <w:vAlign w:val="center"/>
+          </w:tcPr>
+          <w:p>
+            <w:pPr>
+              <w:ind w:left="280" w:right="280"/>
+              <w:jc w:val="center"/>
+              <w:rPr>
+                <w:lang w:eastAsia="zh-TW"/>
+              </w:rPr>
+            </w:pPr>
+            <w:r>
+              <w:rPr>
+                <w:sz w:val="20"/>
+                <w:lang w:eastAsia="zh-TW"/>
+              </w:rPr>
+              <w:t>專案 data.json、build_knowledge_base.py、knowledge_content.json、knowledge_base.faiss；僅來源完整的病蟲害條目入庫，清單記錄來源／索引 SHA-256；建庫版本與資料取得日期依實際清單核對，不以 DOCX 作為語料。</w:t>
+            </w:r>
+          </w:p>
+        </w:tc>
+      </w:tr>
+      <w:tr>
+        <w:trPr>
+          <w:jc w:val="center"/>
+        </w:trPr>
+        <w:tc>
+          <w:tcPr>
+            <w:tcW w:w="1020" w:type="dxa"/>
+            <w:vAlign w:val="center"/>
+          </w:tcPr>
+          <w:p>
+            <w:pPr>
+              <w:ind w:left="280" w:right="280"/>
+              <w:jc w:val="center"/>
+            </w:pPr>
+            <w:r>
+              <w:rPr>
+                <w:sz w:val="20"/>
+              </w:rPr>
+              <w:t>11</w:t>
+            </w:r>
+          </w:p>
+        </w:tc>
+        <w:tc>
+          <w:tcPr>
+            <w:tcW w:w="3288" w:type="dxa"/>
+            <w:vAlign w:val="center"/>
+          </w:tcPr>
+          <w:p>
+            <w:pPr>
+              <w:ind w:left="280" w:right="280"/>
+              <w:jc w:val="center"/>
+              <w:rPr>
+                <w:lang w:eastAsia="zh-TW"/>
+              </w:rPr>
+            </w:pPr>
+            <w:r>
+              <w:rPr>
+                <w:sz w:val="20"/>
+                <w:lang w:eastAsia="zh-TW"/>
+              </w:rPr>
+              <w:t>PlantV</w:t>
+            </w:r>
+            <w:r>
+              <w:rPr>
+                <w:sz w:val="20"/>
+                <w:lang w:eastAsia="zh-TW"/>
+              </w:rPr>
+              <w:t>illage Dataset（影像測試來源）</w:t>
+            </w:r>
+            <w:r>
+              <w:rPr>
+                <w:sz w:val="20"/>
+                <w:lang w:eastAsia="zh-TW"/>
+              </w:rPr>
+            </w:r>
+          </w:p>
+        </w:tc>
+        <w:tc>
+          <w:tcPr>
+            <w:tcW w:w="5159" w:type="dxa"/>
+            <w:vAlign w:val="center"/>
+          </w:tcPr>
+          <w:p>
+            <w:pPr>
+              <w:ind w:left="280" w:right="280"/>
+              <w:jc w:val="center"/>
+              <w:rPr>
+                <w:lang w:eastAsia="zh-TW"/>
+              </w:rPr>
+            </w:pPr>
+            <w:r>
+              <w:rPr>
+                <w:sz w:val="20"/>
+                <w:lang w:eastAsia="zh-TW"/>
+              </w:rPr>
+              <w:t>https://github.com/spMohanty/PlantVillage-Dataset；查閱日期 2026-10-03。專案 scripts/live_image_smoke_test.py 的 TEST_CASES 指定 tomato-early-blight、tomato-late-blight、tomato-healthy 三筆番茄影像；檔名與網址見該檔。網址使用未固定版本的 master；本輪未下載影像或執行真實 Gemini 測試，未產生影像內容雜湊。三筆範例僅供基本功能檢查，不是資料集準確率基準測試。</w:t>
             </w:r>
           </w:p>
         </w:tc>
@@ -805,7 +1198,7 @@
                 <w:sz w:val="20"/>
                 <w:lang w:eastAsia="zh-TW"/>
               </w:rPr>
-              <w:t>章數</w:t>
+              <w:t>章節或圖表</w:t>
             </w:r>
             <w:proofErr w:type="gramEnd"/>
           </w:p>
@@ -847,7 +1240,7 @@
               <w:rPr>
                 <w:sz w:val="20"/>
               </w:rPr>
-              <w:t>Google Gemini</w:t>
+              <w:t>Google Gemini（系統服務）</w:t>
             </w:r>
           </w:p>
         </w:tc>
@@ -869,7 +1262,7 @@
                 <w:sz w:val="20"/>
                 <w:lang w:eastAsia="zh-TW"/>
               </w:rPr>
-              <w:t>系統功能中用於植物影像診斷、狀態分類與病蟲害建議生成。</w:t>
+              <w:t>用於植物影像候選判讀，以及 RAG 建庫與檢索的文字向量（embedding）。病蟲害建議另經資料庫校驗；模型輸出、信心值與來源欄位均不代表專業核准或專家簽核。此列揭露系統服務用途，不推定歷史文件撰寫者。</w:t>
             </w:r>
           </w:p>
         </w:tc>
@@ -889,7 +1282,7 @@
               <w:rPr>
                 <w:sz w:val="20"/>
               </w:rPr>
-              <w:t>3</w:t>
+              <w:t>第 1、3</w:t>
             </w:r>
             <w:r>
               <w:rPr>
@@ -901,7 +1294,7 @@
               <w:rPr>
                 <w:sz w:val="20"/>
               </w:rPr>
-              <w:t>5</w:t>
+              <w:t>5、6、7、8、11、12 章：影像候選判讀、RAG 建庫與檢索流程。</w:t>
             </w:r>
           </w:p>
         </w:tc>
@@ -951,7 +1344,7 @@
               <w:rPr>
                 <w:sz w:val="20"/>
               </w:rPr>
-              <w:t>Google Gemini</w:t>
+              <w:t>OpenAI Codex（本次文件修訂）</w:t>
             </w:r>
           </w:p>
         </w:tc>
@@ -975,7 +1368,7 @@
                 <w:sz w:val="20"/>
                 <w:lang w:eastAsia="zh-TW"/>
               </w:rPr>
-              <w:t>協助製作圖表</w:t>
+              <w:t>2026-10-03 本次修訂用於完整手冊 19 張相異圖表重繪、文件與程式對照、文字及測試表修正。此列僅揭露本次已知用途，不推定原作者的歷史工作，也不取代人工查核或實際驗證。</w:t>
             </w:r>
           </w:p>
         </w:tc>
@@ -998,7 +1391,7 @@
                 <w:sz w:val="20"/>
                 <w:lang w:eastAsia="zh-TW"/>
               </w:rPr>
-              <w:t>5</w:t>
+              <w:t>第 1、3、5</w:t>
             </w:r>
             <w:r>
               <w:rPr>
@@ -1046,7 +1439,7 @@
                 <w:sz w:val="20"/>
                 <w:lang w:eastAsia="zh-TW"/>
               </w:rPr>
-              <w:t>8</w:t>
+              <w:t>8、10、11、12、14 章；完整手冊含 19 張相異重繪圖表。</w:t>
             </w:r>
           </w:p>
         </w:tc>

</xml_diff>

<commit_message>
docs: synchronize transcript revision disclosure and manual page references
</commit_message>
<xml_diff>
--- a/documents/參考資料.docx
+++ b/documents/參考資料.docx
@@ -93,7 +93,6 @@
           <w:cantSplit/>
           <w:tblHeader/>
           <w:jc w:val="center"/>
-          <w:tblHeader/>
         </w:trPr>
         <w:tc>
           <w:tcPr>
@@ -109,8 +108,7 @@
           </w:tcPr>
           <w:p>
             <w:pPr>
-              <w:keepNext w:val="0"/>
-              <w:spacing w:line="240" w:lineRule="auto" w:before="0" w:after="0"/>
+              <w:spacing w:before="0" w:after="0" w:line="240" w:lineRule="auto"/>
               <w:ind w:leftChars="0" w:left="0" w:rightChars="0" w:right="0" w:firstLine="0" w:firstLineChars="0"/>
               <w:jc w:val="center"/>
               <w:rPr>
@@ -122,7 +120,6 @@
               <w:rPr>
                 <w:rFonts w:cs="Times New Roman" w:ascii="Times New Roman" w:hAnsi="Times New Roman" w:eastAsia="標楷體"/>
                 <w:b/>
-                <w:color w:val="000000"/>
                 <w:sz w:val="28"/>
                 <w:szCs w:val="28"/>
               </w:rPr>
@@ -144,8 +141,7 @@
           </w:tcPr>
           <w:p>
             <w:pPr>
-              <w:keepNext w:val="0"/>
-              <w:spacing w:line="240" w:lineRule="auto" w:before="0" w:after="0"/>
+              <w:spacing w:before="0" w:after="0" w:line="240" w:lineRule="auto"/>
               <w:ind w:leftChars="0" w:left="0" w:rightChars="0" w:right="0" w:firstLine="0" w:firstLineChars="0"/>
               <w:jc w:val="center"/>
               <w:rPr>
@@ -157,7 +153,6 @@
               <w:rPr>
                 <w:rFonts w:cs="Times New Roman" w:ascii="Times New Roman" w:hAnsi="Times New Roman" w:eastAsia="標楷體"/>
                 <w:b/>
-                <w:color w:val="000000"/>
                 <w:sz w:val="28"/>
                 <w:szCs w:val="28"/>
               </w:rPr>
@@ -179,8 +174,7 @@
           </w:tcPr>
           <w:p>
             <w:pPr>
-              <w:keepNext w:val="0"/>
-              <w:spacing w:line="240" w:lineRule="auto" w:before="0" w:after="0"/>
+              <w:spacing w:before="0" w:after="0" w:line="240" w:lineRule="auto"/>
               <w:ind w:leftChars="0" w:left="0" w:rightChars="0" w:right="0" w:firstLine="0" w:firstLineChars="0"/>
               <w:jc w:val="center"/>
               <w:rPr>
@@ -192,7 +186,6 @@
               <w:rPr>
                 <w:rFonts w:cs="Times New Roman" w:ascii="Times New Roman" w:hAnsi="Times New Roman" w:eastAsia="標楷體"/>
                 <w:b/>
-                <w:color w:val="000000"/>
                 <w:sz w:val="28"/>
                 <w:szCs w:val="28"/>
               </w:rPr>
@@ -219,8 +212,7 @@
           </w:tcPr>
           <w:p>
             <w:pPr>
-              <w:keepNext w:val="0"/>
-              <w:spacing w:line="240" w:lineRule="auto" w:before="0" w:after="0"/>
+              <w:spacing w:before="0" w:after="0" w:line="240" w:lineRule="auto"/>
               <w:ind w:leftChars="0" w:left="0" w:rightChars="0" w:right="0" w:firstLine="0" w:firstLineChars="0"/>
               <w:jc w:val="center"/>
               <w:rPr>
@@ -231,7 +223,6 @@
             <w:r>
               <w:rPr>
                 <w:rFonts w:cs="Times New Roman" w:ascii="Times New Roman" w:hAnsi="Times New Roman" w:eastAsia="標楷體"/>
-                <w:color w:val="000000"/>
                 <w:sz w:val="28"/>
                 <w:szCs w:val="28"/>
               </w:rPr>
@@ -252,8 +243,7 @@
           </w:tcPr>
           <w:p>
             <w:pPr>
-              <w:keepNext w:val="0"/>
-              <w:spacing w:line="240" w:lineRule="auto" w:before="0" w:after="0"/>
+              <w:spacing w:before="0" w:after="0" w:line="240" w:lineRule="auto"/>
               <w:ind w:leftChars="0" w:left="0" w:rightChars="0" w:right="0" w:firstLine="0" w:firstLineChars="0"/>
               <w:jc w:val="center"/>
               <w:rPr>
@@ -264,7 +254,6 @@
             <w:r>
               <w:rPr>
                 <w:rFonts w:cs="Times New Roman" w:ascii="Times New Roman" w:hAnsi="Times New Roman" w:eastAsia="標楷體"/>
-                <w:color w:val="000000"/>
                 <w:sz w:val="28"/>
                 <w:szCs w:val="28"/>
               </w:rPr>
@@ -285,8 +274,7 @@
           </w:tcPr>
           <w:p>
             <w:pPr>
-              <w:keepNext w:val="0"/>
-              <w:spacing w:line="240" w:lineRule="auto" w:before="0" w:after="0"/>
+              <w:spacing w:before="0" w:after="0" w:line="240" w:lineRule="auto"/>
               <w:ind w:leftChars="0" w:left="0" w:rightChars="0" w:right="0" w:firstLine="0" w:firstLineChars="0"/>
               <w:jc w:val="center"/>
               <w:rPr>
@@ -297,7 +285,6 @@
             <w:r>
               <w:rPr>
                 <w:rFonts w:cs="Times New Roman" w:ascii="Times New Roman" w:hAnsi="Times New Roman" w:eastAsia="標楷體"/>
-                <w:color w:val="000000"/>
                 <w:sz w:val="28"/>
                 <w:szCs w:val="28"/>
               </w:rPr>
@@ -306,7 +293,6 @@
             <w:r>
               <w:rPr>
                 <w:rFonts w:cs="Times New Roman" w:ascii="Times New Roman" w:hAnsi="Times New Roman" w:eastAsia="標楷體"/>
-                <w:color w:val="000000"/>
                 <w:sz w:val="28"/>
                 <w:szCs w:val="28"/>
               </w:rPr>
@@ -315,7 +301,6 @@
             <w:r>
               <w:rPr>
                 <w:rFonts w:cs="Times New Roman" w:ascii="Times New Roman" w:hAnsi="Times New Roman" w:eastAsia="標楷體"/>
-                <w:color w:val="000000"/>
                 <w:sz w:val="28"/>
                 <w:szCs w:val="28"/>
               </w:rPr>
@@ -324,7 +309,6 @@
             <w:r>
               <w:rPr>
                 <w:rFonts w:cs="Times New Roman" w:ascii="Times New Roman" w:hAnsi="Times New Roman" w:eastAsia="標楷體"/>
-                <w:color w:val="000000"/>
                 <w:sz w:val="28"/>
                 <w:szCs w:val="28"/>
               </w:rPr>
@@ -333,7 +317,6 @@
             <w:r>
               <w:rPr>
                 <w:rFonts w:cs="Times New Roman" w:ascii="Times New Roman" w:hAnsi="Times New Roman" w:eastAsia="標楷體"/>
-                <w:color w:val="000000"/>
                 <w:sz w:val="28"/>
                 <w:szCs w:val="28"/>
               </w:rPr>
@@ -342,7 +325,6 @@
             <w:r>
               <w:rPr>
                 <w:rFonts w:cs="Times New Roman" w:ascii="Times New Roman" w:hAnsi="Times New Roman" w:eastAsia="標楷體"/>
-                <w:color w:val="000000"/>
                 <w:sz w:val="28"/>
                 <w:szCs w:val="28"/>
               </w:rPr>
@@ -351,7 +333,6 @@
             <w:r>
               <w:rPr>
                 <w:rFonts w:cs="Times New Roman" w:ascii="Times New Roman" w:hAnsi="Times New Roman" w:eastAsia="標楷體"/>
-                <w:color w:val="000000"/>
                 <w:sz w:val="28"/>
                 <w:szCs w:val="28"/>
               </w:rPr>
@@ -360,7 +341,6 @@
             <w:r>
               <w:rPr>
                 <w:rFonts w:cs="Times New Roman" w:ascii="Times New Roman" w:hAnsi="Times New Roman" w:eastAsia="標楷體"/>
-                <w:color w:val="000000"/>
                 <w:sz w:val="28"/>
                 <w:szCs w:val="28"/>
               </w:rPr>
@@ -369,7 +349,6 @@
             <w:r>
               <w:rPr>
                 <w:rFonts w:cs="Times New Roman" w:ascii="Times New Roman" w:hAnsi="Times New Roman" w:eastAsia="標楷體"/>
-                <w:color w:val="000000"/>
                 <w:sz w:val="28"/>
                 <w:szCs w:val="28"/>
               </w:rPr>
@@ -396,8 +375,7 @@
           </w:tcPr>
           <w:p>
             <w:pPr>
-              <w:keepNext w:val="0"/>
-              <w:spacing w:line="240" w:lineRule="auto" w:before="0" w:after="0"/>
+              <w:spacing w:before="0" w:after="0" w:line="240" w:lineRule="auto"/>
               <w:ind w:leftChars="0" w:left="0" w:rightChars="0" w:right="0" w:firstLine="0" w:firstLineChars="0"/>
               <w:jc w:val="center"/>
               <w:rPr>
@@ -408,7 +386,6 @@
             <w:r>
               <w:rPr>
                 <w:rFonts w:cs="Times New Roman" w:ascii="Times New Roman" w:hAnsi="Times New Roman" w:eastAsia="標楷體"/>
-                <w:color w:val="000000"/>
                 <w:sz w:val="28"/>
                 <w:szCs w:val="28"/>
               </w:rPr>
@@ -429,8 +406,7 @@
           </w:tcPr>
           <w:p>
             <w:pPr>
-              <w:keepNext w:val="0"/>
-              <w:spacing w:line="240" w:lineRule="auto" w:before="0" w:after="0"/>
+              <w:spacing w:before="0" w:after="0" w:line="240" w:lineRule="auto"/>
               <w:ind w:leftChars="0" w:left="0" w:rightChars="0" w:right="0" w:firstLine="0" w:firstLineChars="0"/>
               <w:jc w:val="center"/>
               <w:rPr>
@@ -441,7 +417,6 @@
             <w:r>
               <w:rPr>
                 <w:rFonts w:cs="Times New Roman" w:ascii="Times New Roman" w:hAnsi="Times New Roman" w:eastAsia="標楷體"/>
-                <w:color w:val="000000"/>
                 <w:sz w:val="28"/>
                 <w:szCs w:val="28"/>
               </w:rPr>
@@ -450,7 +425,6 @@
             <w:r>
               <w:rPr>
                 <w:rFonts w:cs="Times New Roman" w:ascii="Times New Roman" w:hAnsi="Times New Roman" w:eastAsia="標楷體"/>
-                <w:color w:val="000000"/>
                 <w:sz w:val="28"/>
                 <w:szCs w:val="28"/>
               </w:rPr>
@@ -471,8 +445,7 @@
           </w:tcPr>
           <w:p>
             <w:pPr>
-              <w:keepNext w:val="0"/>
-              <w:spacing w:line="240" w:lineRule="auto" w:before="0" w:after="0"/>
+              <w:spacing w:before="0" w:after="0" w:line="240" w:lineRule="auto"/>
               <w:ind w:leftChars="0" w:left="0" w:rightChars="0" w:right="0" w:firstLine="0" w:firstLineChars="0"/>
               <w:jc w:val="center"/>
               <w:rPr>
@@ -483,7 +456,6 @@
             <w:r>
               <w:rPr>
                 <w:rFonts w:cs="Times New Roman" w:ascii="Times New Roman" w:hAnsi="Times New Roman" w:eastAsia="標楷體"/>
-                <w:color w:val="000000"/>
                 <w:sz w:val="28"/>
                 <w:szCs w:val="28"/>
               </w:rPr>
@@ -492,7 +464,6 @@
             <w:r>
               <w:rPr>
                 <w:rFonts w:cs="Times New Roman" w:ascii="Times New Roman" w:hAnsi="Times New Roman" w:eastAsia="標楷體"/>
-                <w:color w:val="000000"/>
                 <w:sz w:val="28"/>
                 <w:szCs w:val="28"/>
               </w:rPr>
@@ -501,7 +472,6 @@
             <w:r>
               <w:rPr>
                 <w:rFonts w:cs="Times New Roman" w:ascii="Times New Roman" w:hAnsi="Times New Roman" w:eastAsia="標楷體"/>
-                <w:color w:val="000000"/>
                 <w:sz w:val="28"/>
                 <w:szCs w:val="28"/>
               </w:rPr>
@@ -510,7 +480,6 @@
             <w:r>
               <w:rPr>
                 <w:rFonts w:cs="Times New Roman" w:ascii="Times New Roman" w:hAnsi="Times New Roman" w:eastAsia="標楷體"/>
-                <w:color w:val="000000"/>
                 <w:sz w:val="28"/>
                 <w:szCs w:val="28"/>
               </w:rPr>
@@ -519,7 +488,6 @@
             <w:r>
               <w:rPr>
                 <w:rFonts w:cs="Times New Roman" w:ascii="Times New Roman" w:hAnsi="Times New Roman" w:eastAsia="標楷體"/>
-                <w:color w:val="000000"/>
                 <w:sz w:val="28"/>
                 <w:szCs w:val="28"/>
               </w:rPr>
@@ -528,7 +496,6 @@
             <w:r>
               <w:rPr>
                 <w:rFonts w:cs="Times New Roman" w:ascii="Times New Roman" w:hAnsi="Times New Roman" w:eastAsia="標楷體"/>
-                <w:color w:val="000000"/>
                 <w:sz w:val="28"/>
                 <w:szCs w:val="28"/>
               </w:rPr>
@@ -537,7 +504,6 @@
             <w:r>
               <w:rPr>
                 <w:rFonts w:cs="Times New Roman" w:ascii="Times New Roman" w:hAnsi="Times New Roman" w:eastAsia="標楷體"/>
-                <w:color w:val="000000"/>
                 <w:sz w:val="28"/>
                 <w:szCs w:val="28"/>
               </w:rPr>
@@ -546,7 +512,6 @@
             <w:r>
               <w:rPr>
                 <w:rFonts w:cs="Times New Roman" w:ascii="Times New Roman" w:hAnsi="Times New Roman" w:eastAsia="標楷體"/>
-                <w:color w:val="000000"/>
                 <w:sz w:val="28"/>
                 <w:szCs w:val="28"/>
               </w:rPr>
@@ -555,7 +520,6 @@
             <w:r>
               <w:rPr>
                 <w:rFonts w:cs="Times New Roman" w:ascii="Times New Roman" w:hAnsi="Times New Roman" w:eastAsia="標楷體"/>
-                <w:color w:val="000000"/>
                 <w:sz w:val="28"/>
                 <w:szCs w:val="28"/>
               </w:rPr>
@@ -564,7 +528,6 @@
             <w:r>
               <w:rPr>
                 <w:rFonts w:cs="Times New Roman" w:ascii="Times New Roman" w:hAnsi="Times New Roman" w:eastAsia="標楷體"/>
-                <w:color w:val="000000"/>
                 <w:sz w:val="28"/>
                 <w:szCs w:val="28"/>
               </w:rPr>
@@ -573,7 +536,6 @@
             <w:r>
               <w:rPr>
                 <w:rFonts w:cs="Times New Roman" w:ascii="Times New Roman" w:hAnsi="Times New Roman" w:eastAsia="標楷體"/>
-                <w:color w:val="000000"/>
                 <w:sz w:val="28"/>
                 <w:szCs w:val="28"/>
               </w:rPr>
@@ -582,7 +544,6 @@
             <w:r>
               <w:rPr>
                 <w:rFonts w:cs="Times New Roman" w:ascii="Times New Roman" w:hAnsi="Times New Roman" w:eastAsia="標楷體"/>
-                <w:color w:val="000000"/>
                 <w:sz w:val="28"/>
                 <w:szCs w:val="28"/>
               </w:rPr>
@@ -591,7 +552,6 @@
             <w:r>
               <w:rPr>
                 <w:rFonts w:cs="Times New Roman" w:ascii="Times New Roman" w:hAnsi="Times New Roman" w:eastAsia="標楷體"/>
-                <w:color w:val="000000"/>
                 <w:sz w:val="28"/>
                 <w:szCs w:val="28"/>
               </w:rPr>
@@ -600,7 +560,6 @@
             <w:r>
               <w:rPr>
                 <w:rFonts w:cs="Times New Roman" w:ascii="Times New Roman" w:hAnsi="Times New Roman" w:eastAsia="標楷體"/>
-                <w:color w:val="000000"/>
                 <w:sz w:val="28"/>
                 <w:szCs w:val="28"/>
               </w:rPr>
@@ -627,8 +586,7 @@
           </w:tcPr>
           <w:p>
             <w:pPr>
-              <w:keepNext w:val="0"/>
-              <w:spacing w:line="240" w:lineRule="auto" w:before="0" w:after="0"/>
+              <w:spacing w:before="0" w:after="0" w:line="240" w:lineRule="auto"/>
               <w:ind w:leftChars="0" w:left="0" w:rightChars="0" w:right="0" w:firstLine="0" w:firstLineChars="0"/>
               <w:jc w:val="center"/>
               <w:rPr>
@@ -639,7 +597,6 @@
             <w:r>
               <w:rPr>
                 <w:rFonts w:cs="Times New Roman" w:ascii="Times New Roman" w:hAnsi="Times New Roman" w:eastAsia="標楷體"/>
-                <w:color w:val="000000"/>
                 <w:sz w:val="28"/>
                 <w:szCs w:val="28"/>
               </w:rPr>
@@ -660,8 +617,7 @@
           </w:tcPr>
           <w:p>
             <w:pPr>
-              <w:keepNext w:val="0"/>
-              <w:spacing w:line="240" w:lineRule="auto" w:before="0" w:after="0"/>
+              <w:spacing w:before="0" w:after="0" w:line="240" w:lineRule="auto"/>
               <w:ind w:leftChars="0" w:left="0" w:rightChars="0" w:right="0" w:firstLine="0" w:firstLineChars="0"/>
               <w:jc w:val="center"/>
               <w:rPr>
@@ -672,7 +628,6 @@
             <w:r>
               <w:rPr>
                 <w:rFonts w:cs="Times New Roman" w:ascii="Times New Roman" w:hAnsi="Times New Roman" w:eastAsia="標楷體"/>
-                <w:color w:val="000000"/>
                 <w:sz w:val="28"/>
                 <w:szCs w:val="28"/>
               </w:rPr>
@@ -693,8 +648,7 @@
           </w:tcPr>
           <w:p>
             <w:pPr>
-              <w:keepNext w:val="0"/>
-              <w:spacing w:line="240" w:lineRule="auto" w:before="0" w:after="0"/>
+              <w:spacing w:before="0" w:after="0" w:line="240" w:lineRule="auto"/>
               <w:ind w:leftChars="0" w:left="0" w:rightChars="0" w:right="0" w:firstLine="0" w:firstLineChars="0"/>
               <w:jc w:val="center"/>
               <w:rPr>
@@ -706,7 +660,6 @@
             <w:r>
               <w:rPr>
                 <w:rFonts w:cs="Times New Roman" w:ascii="Times New Roman" w:hAnsi="Times New Roman" w:eastAsia="標楷體"/>
-                <w:color w:val="000000"/>
                 <w:sz w:val="28"/>
                 <w:szCs w:val="28"/>
                 <w:lang w:eastAsia="zh-TW"/>
@@ -716,7 +669,6 @@
             <w:r>
               <w:rPr>
                 <w:rFonts w:cs="Times New Roman" w:ascii="Times New Roman" w:hAnsi="Times New Roman" w:eastAsia="標楷體"/>
-                <w:color w:val="000000"/>
                 <w:sz w:val="28"/>
                 <w:szCs w:val="28"/>
                 <w:lang w:eastAsia="zh-TW"/>
@@ -726,7 +678,6 @@
             <w:r>
               <w:rPr>
                 <w:rFonts w:cs="Times New Roman" w:ascii="Times New Roman" w:hAnsi="Times New Roman" w:eastAsia="標楷體"/>
-                <w:color w:val="000000"/>
                 <w:sz w:val="28"/>
                 <w:szCs w:val="28"/>
                 <w:lang w:eastAsia="zh-TW"/>
@@ -736,7 +687,6 @@
             <w:r>
               <w:rPr>
                 <w:rFonts w:cs="Times New Roman" w:ascii="Times New Roman" w:hAnsi="Times New Roman" w:eastAsia="標楷體"/>
-                <w:color w:val="000000"/>
                 <w:sz w:val="28"/>
                 <w:szCs w:val="28"/>
                 <w:lang w:eastAsia="zh-TW"/>
@@ -746,7 +696,6 @@
             <w:r>
               <w:rPr>
                 <w:rFonts w:cs="Times New Roman" w:ascii="Times New Roman" w:hAnsi="Times New Roman" w:eastAsia="標楷體"/>
-                <w:color w:val="000000"/>
                 <w:sz w:val="28"/>
                 <w:szCs w:val="28"/>
                 <w:lang w:eastAsia="zh-TW"/>
@@ -756,7 +705,6 @@
             <w:r>
               <w:rPr>
                 <w:rFonts w:cs="Times New Roman" w:ascii="Times New Roman" w:hAnsi="Times New Roman" w:eastAsia="標楷體"/>
-                <w:color w:val="000000"/>
                 <w:sz w:val="28"/>
                 <w:szCs w:val="28"/>
                 <w:lang w:eastAsia="zh-TW"/>
@@ -766,7 +714,6 @@
             <w:r>
               <w:rPr>
                 <w:rFonts w:cs="Times New Roman" w:ascii="Times New Roman" w:hAnsi="Times New Roman" w:eastAsia="標楷體"/>
-                <w:color w:val="000000"/>
                 <w:sz w:val="28"/>
                 <w:szCs w:val="28"/>
                 <w:lang w:eastAsia="zh-TW"/>
@@ -776,7 +723,6 @@
             <w:r>
               <w:rPr>
                 <w:rFonts w:cs="Times New Roman" w:ascii="Times New Roman" w:hAnsi="Times New Roman" w:eastAsia="標楷體"/>
-                <w:color w:val="000000"/>
                 <w:sz w:val="28"/>
                 <w:szCs w:val="28"/>
                 <w:lang w:eastAsia="zh-TW"/>
@@ -786,7 +732,6 @@
             <w:r>
               <w:rPr>
                 <w:rFonts w:cs="Times New Roman" w:ascii="Times New Roman" w:hAnsi="Times New Roman" w:eastAsia="標楷體"/>
-                <w:color w:val="000000"/>
                 <w:sz w:val="28"/>
                 <w:szCs w:val="28"/>
                 <w:lang w:eastAsia="zh-TW"/>
@@ -796,7 +741,6 @@
             <w:r>
               <w:rPr>
                 <w:rFonts w:cs="Times New Roman" w:ascii="Times New Roman" w:hAnsi="Times New Roman" w:eastAsia="標楷體"/>
-                <w:color w:val="000000"/>
                 <w:sz w:val="28"/>
                 <w:szCs w:val="28"/>
                 <w:lang w:eastAsia="zh-TW"/>
@@ -806,7 +750,6 @@
             <w:r>
               <w:rPr>
                 <w:rFonts w:cs="Times New Roman" w:ascii="Times New Roman" w:hAnsi="Times New Roman" w:eastAsia="標楷體"/>
-                <w:color w:val="000000"/>
                 <w:sz w:val="28"/>
                 <w:szCs w:val="28"/>
                 <w:lang w:eastAsia="zh-TW"/>
@@ -816,7 +759,6 @@
             <w:r>
               <w:rPr>
                 <w:rFonts w:cs="Times New Roman" w:ascii="Times New Roman" w:hAnsi="Times New Roman" w:eastAsia="標楷體"/>
-                <w:color w:val="000000"/>
                 <w:sz w:val="28"/>
                 <w:szCs w:val="28"/>
                 <w:lang w:eastAsia="zh-TW"/>
@@ -826,7 +768,6 @@
             <w:r>
               <w:rPr>
                 <w:rFonts w:cs="Times New Roman" w:ascii="Times New Roman" w:hAnsi="Times New Roman" w:eastAsia="標楷體"/>
-                <w:color w:val="000000"/>
                 <w:sz w:val="28"/>
                 <w:szCs w:val="28"/>
                 <w:lang w:eastAsia="zh-TW"/>
@@ -854,8 +795,7 @@
           </w:tcPr>
           <w:p>
             <w:pPr>
-              <w:keepNext w:val="0"/>
-              <w:spacing w:line="240" w:lineRule="auto" w:before="0" w:after="0"/>
+              <w:spacing w:before="0" w:after="0" w:line="240" w:lineRule="auto"/>
               <w:ind w:leftChars="0" w:left="0" w:rightChars="0" w:right="0" w:firstLine="0" w:firstLineChars="0"/>
               <w:jc w:val="center"/>
               <w:rPr>
@@ -866,7 +806,6 @@
             <w:r>
               <w:rPr>
                 <w:rFonts w:cs="Times New Roman" w:ascii="Times New Roman" w:hAnsi="Times New Roman" w:eastAsia="標楷體"/>
-                <w:color w:val="000000"/>
                 <w:sz w:val="28"/>
                 <w:szCs w:val="28"/>
               </w:rPr>
@@ -887,8 +826,7 @@
           </w:tcPr>
           <w:p>
             <w:pPr>
-              <w:keepNext w:val="0"/>
-              <w:spacing w:line="240" w:lineRule="auto" w:before="0" w:after="0"/>
+              <w:spacing w:before="0" w:after="0" w:line="240" w:lineRule="auto"/>
               <w:ind w:leftChars="0" w:left="0" w:rightChars="0" w:right="0" w:firstLine="0" w:firstLineChars="0"/>
               <w:jc w:val="center"/>
               <w:rPr>
@@ -899,7 +837,6 @@
             <w:r>
               <w:rPr>
                 <w:rFonts w:cs="Times New Roman" w:ascii="Times New Roman" w:hAnsi="Times New Roman" w:eastAsia="標楷體"/>
-                <w:color w:val="000000"/>
                 <w:sz w:val="28"/>
                 <w:szCs w:val="28"/>
               </w:rPr>
@@ -920,8 +857,7 @@
           </w:tcPr>
           <w:p>
             <w:pPr>
-              <w:keepNext w:val="0"/>
-              <w:spacing w:line="240" w:lineRule="auto" w:before="0" w:after="0"/>
+              <w:spacing w:before="0" w:after="0" w:line="240" w:lineRule="auto"/>
               <w:ind w:leftChars="0" w:left="0" w:rightChars="0" w:right="0" w:firstLine="0" w:firstLineChars="0"/>
               <w:jc w:val="center"/>
               <w:rPr>
@@ -933,7 +869,6 @@
             <w:r>
               <w:rPr>
                 <w:rFonts w:cs="Times New Roman" w:ascii="Times New Roman" w:hAnsi="Times New Roman" w:eastAsia="標楷體"/>
-                <w:color w:val="000000"/>
                 <w:sz w:val="28"/>
                 <w:szCs w:val="28"/>
                 <w:lang w:eastAsia="zh-TW"/>
@@ -943,7 +878,6 @@
             <w:r>
               <w:rPr>
                 <w:rFonts w:cs="Times New Roman" w:ascii="Times New Roman" w:hAnsi="Times New Roman" w:eastAsia="標楷體"/>
-                <w:color w:val="000000"/>
                 <w:sz w:val="28"/>
                 <w:szCs w:val="28"/>
                 <w:lang w:eastAsia="zh-TW"/>
@@ -953,7 +887,6 @@
             <w:r>
               <w:rPr>
                 <w:rFonts w:cs="Times New Roman" w:ascii="Times New Roman" w:hAnsi="Times New Roman" w:eastAsia="標楷體"/>
-                <w:color w:val="000000"/>
                 <w:sz w:val="28"/>
                 <w:szCs w:val="28"/>
                 <w:lang w:eastAsia="zh-TW"/>
@@ -963,7 +896,6 @@
             <w:r>
               <w:rPr>
                 <w:rFonts w:cs="Times New Roman" w:ascii="Times New Roman" w:hAnsi="Times New Roman" w:eastAsia="標楷體"/>
-                <w:color w:val="000000"/>
                 <w:sz w:val="28"/>
                 <w:szCs w:val="28"/>
                 <w:lang w:eastAsia="zh-TW"/>
@@ -973,7 +905,6 @@
             <w:r>
               <w:rPr>
                 <w:rFonts w:cs="Times New Roman" w:ascii="Times New Roman" w:hAnsi="Times New Roman" w:eastAsia="標楷體"/>
-                <w:color w:val="000000"/>
                 <w:sz w:val="28"/>
                 <w:szCs w:val="28"/>
                 <w:lang w:eastAsia="zh-TW"/>
@@ -983,7 +914,6 @@
             <w:r>
               <w:rPr>
                 <w:rFonts w:cs="Times New Roman" w:ascii="Times New Roman" w:hAnsi="Times New Roman" w:eastAsia="標楷體"/>
-                <w:color w:val="000000"/>
                 <w:sz w:val="28"/>
                 <w:szCs w:val="28"/>
                 <w:lang w:eastAsia="zh-TW"/>
@@ -993,7 +923,6 @@
             <w:r>
               <w:rPr>
                 <w:rFonts w:cs="Times New Roman" w:ascii="Times New Roman" w:hAnsi="Times New Roman" w:eastAsia="標楷體"/>
-                <w:color w:val="000000"/>
                 <w:sz w:val="28"/>
                 <w:szCs w:val="28"/>
                 <w:lang w:eastAsia="zh-TW"/>
@@ -1021,8 +950,7 @@
           </w:tcPr>
           <w:p>
             <w:pPr>
-              <w:keepNext w:val="0"/>
-              <w:spacing w:line="240" w:lineRule="auto" w:before="0" w:after="0"/>
+              <w:spacing w:before="0" w:after="0" w:line="240" w:lineRule="auto"/>
               <w:ind w:leftChars="0" w:left="0" w:rightChars="0" w:right="0" w:firstLine="0" w:firstLineChars="0"/>
               <w:jc w:val="center"/>
               <w:rPr>
@@ -1033,7 +961,6 @@
             <w:r>
               <w:rPr>
                 <w:rFonts w:cs="Times New Roman" w:ascii="Times New Roman" w:hAnsi="Times New Roman" w:eastAsia="標楷體"/>
-                <w:color w:val="000000"/>
                 <w:sz w:val="28"/>
                 <w:szCs w:val="28"/>
               </w:rPr>
@@ -1054,8 +981,7 @@
           </w:tcPr>
           <w:p>
             <w:pPr>
-              <w:keepNext w:val="0"/>
-              <w:spacing w:line="240" w:lineRule="auto" w:before="0" w:after="0"/>
+              <w:spacing w:before="0" w:after="0" w:line="240" w:lineRule="auto"/>
               <w:ind w:leftChars="0" w:left="0" w:rightChars="0" w:right="0" w:firstLine="0" w:firstLineChars="0"/>
               <w:jc w:val="center"/>
               <w:rPr>
@@ -1066,7 +992,6 @@
             <w:r>
               <w:rPr>
                 <w:rFonts w:cs="Times New Roman" w:ascii="Times New Roman" w:hAnsi="Times New Roman" w:eastAsia="標楷體"/>
-                <w:color w:val="000000"/>
                 <w:sz w:val="28"/>
                 <w:szCs w:val="28"/>
               </w:rPr>
@@ -1087,8 +1012,7 @@
           </w:tcPr>
           <w:p>
             <w:pPr>
-              <w:keepNext w:val="0"/>
-              <w:spacing w:line="240" w:lineRule="auto" w:before="0" w:after="0"/>
+              <w:spacing w:before="0" w:after="0" w:line="240" w:lineRule="auto"/>
               <w:ind w:leftChars="0" w:left="0" w:rightChars="0" w:right="0" w:firstLine="0" w:firstLineChars="0"/>
               <w:jc w:val="center"/>
               <w:rPr>
@@ -1100,7 +1024,6 @@
             <w:r>
               <w:rPr>
                 <w:rFonts w:cs="Times New Roman" w:ascii="Times New Roman" w:hAnsi="Times New Roman" w:eastAsia="標楷體"/>
-                <w:color w:val="000000"/>
                 <w:sz w:val="28"/>
                 <w:szCs w:val="28"/>
                 <w:lang w:eastAsia="zh-TW"/>
@@ -1110,7 +1033,6 @@
             <w:r>
               <w:rPr>
                 <w:rFonts w:cs="Times New Roman" w:ascii="Times New Roman" w:hAnsi="Times New Roman" w:eastAsia="標楷體"/>
-                <w:color w:val="000000"/>
                 <w:sz w:val="28"/>
                 <w:szCs w:val="28"/>
                 <w:lang w:eastAsia="zh-TW"/>
@@ -1120,7 +1042,6 @@
             <w:r>
               <w:rPr>
                 <w:rFonts w:cs="Times New Roman" w:ascii="Times New Roman" w:hAnsi="Times New Roman" w:eastAsia="標楷體"/>
-                <w:color w:val="000000"/>
                 <w:sz w:val="28"/>
                 <w:szCs w:val="28"/>
                 <w:lang w:eastAsia="zh-TW"/>
@@ -1130,7 +1051,6 @@
             <w:r>
               <w:rPr>
                 <w:rFonts w:cs="Times New Roman" w:ascii="Times New Roman" w:hAnsi="Times New Roman" w:eastAsia="標楷體"/>
-                <w:color w:val="000000"/>
                 <w:sz w:val="28"/>
                 <w:szCs w:val="28"/>
                 <w:lang w:eastAsia="zh-TW"/>
@@ -1140,7 +1060,6 @@
             <w:r>
               <w:rPr>
                 <w:rFonts w:cs="Times New Roman" w:ascii="Times New Roman" w:hAnsi="Times New Roman" w:eastAsia="標楷體"/>
-                <w:color w:val="000000"/>
                 <w:sz w:val="28"/>
                 <w:szCs w:val="28"/>
                 <w:lang w:eastAsia="zh-TW"/>
@@ -1150,7 +1069,6 @@
             <w:r>
               <w:rPr>
                 <w:rFonts w:cs="Times New Roman" w:ascii="Times New Roman" w:hAnsi="Times New Roman" w:eastAsia="標楷體"/>
-                <w:color w:val="000000"/>
                 <w:sz w:val="28"/>
                 <w:szCs w:val="28"/>
                 <w:lang w:eastAsia="zh-TW"/>
@@ -1160,7 +1078,6 @@
             <w:r>
               <w:rPr>
                 <w:rFonts w:cs="Times New Roman" w:ascii="Times New Roman" w:hAnsi="Times New Roman" w:eastAsia="標楷體"/>
-                <w:color w:val="000000"/>
                 <w:sz w:val="28"/>
                 <w:szCs w:val="28"/>
                 <w:lang w:eastAsia="zh-TW"/>
@@ -1170,7 +1087,6 @@
             <w:r>
               <w:rPr>
                 <w:rFonts w:cs="Times New Roman" w:ascii="Times New Roman" w:hAnsi="Times New Roman" w:eastAsia="標楷體"/>
-                <w:color w:val="000000"/>
                 <w:sz w:val="28"/>
                 <w:szCs w:val="28"/>
                 <w:lang w:eastAsia="zh-TW"/>
@@ -1180,7 +1096,6 @@
             <w:r>
               <w:rPr>
                 <w:rFonts w:cs="Times New Roman" w:ascii="Times New Roman" w:hAnsi="Times New Roman" w:eastAsia="標楷體"/>
-                <w:color w:val="000000"/>
                 <w:sz w:val="28"/>
                 <w:szCs w:val="28"/>
                 <w:lang w:eastAsia="zh-TW"/>
@@ -1190,7 +1105,6 @@
             <w:r>
               <w:rPr>
                 <w:rFonts w:cs="Times New Roman" w:ascii="Times New Roman" w:hAnsi="Times New Roman" w:eastAsia="標楷體"/>
-                <w:color w:val="000000"/>
                 <w:sz w:val="28"/>
                 <w:szCs w:val="28"/>
                 <w:lang w:eastAsia="zh-TW"/>
@@ -1218,8 +1132,7 @@
           </w:tcPr>
           <w:p>
             <w:pPr>
-              <w:keepNext w:val="0"/>
-              <w:spacing w:line="240" w:lineRule="auto" w:before="0" w:after="0"/>
+              <w:spacing w:before="0" w:after="0" w:line="240" w:lineRule="auto"/>
               <w:ind w:leftChars="0" w:left="0" w:rightChars="0" w:right="0" w:firstLine="0" w:firstLineChars="0"/>
               <w:jc w:val="center"/>
               <w:rPr>
@@ -1230,7 +1143,6 @@
             <w:r>
               <w:rPr>
                 <w:rFonts w:cs="Times New Roman" w:ascii="Times New Roman" w:hAnsi="Times New Roman" w:eastAsia="標楷體"/>
-                <w:color w:val="000000"/>
                 <w:sz w:val="28"/>
                 <w:szCs w:val="28"/>
               </w:rPr>
@@ -1251,8 +1163,7 @@
           </w:tcPr>
           <w:p>
             <w:pPr>
-              <w:keepNext w:val="0"/>
-              <w:spacing w:line="240" w:lineRule="auto" w:before="0" w:after="0"/>
+              <w:spacing w:before="0" w:after="0" w:line="240" w:lineRule="auto"/>
               <w:ind w:leftChars="0" w:left="0" w:rightChars="0" w:right="0" w:firstLine="0" w:firstLineChars="0"/>
               <w:jc w:val="center"/>
               <w:rPr>
@@ -1264,7 +1175,6 @@
             <w:r>
               <w:rPr>
                 <w:rFonts w:cs="Times New Roman" w:ascii="Times New Roman" w:hAnsi="Times New Roman" w:eastAsia="標楷體"/>
-                <w:color w:val="000000"/>
                 <w:sz w:val="28"/>
                 <w:szCs w:val="28"/>
                 <w:lang w:eastAsia="zh-TW"/>
@@ -1286,8 +1196,7 @@
           </w:tcPr>
           <w:p>
             <w:pPr>
-              <w:keepNext w:val="0"/>
-              <w:spacing w:line="240" w:lineRule="auto" w:before="0" w:after="0"/>
+              <w:spacing w:before="0" w:after="0" w:line="240" w:lineRule="auto"/>
               <w:ind w:leftChars="0" w:left="0" w:rightChars="0" w:right="0" w:firstLine="0" w:firstLineChars="0"/>
               <w:jc w:val="center"/>
               <w:rPr>
@@ -1299,7 +1208,6 @@
             <w:r>
               <w:rPr>
                 <w:rFonts w:cs="Times New Roman" w:ascii="Times New Roman" w:hAnsi="Times New Roman" w:eastAsia="標楷體"/>
-                <w:color w:val="000000"/>
                 <w:sz w:val="28"/>
                 <w:szCs w:val="28"/>
                 <w:lang w:eastAsia="zh-TW"/>
@@ -1309,7 +1217,6 @@
             <w:r>
               <w:rPr>
                 <w:rFonts w:cs="Times New Roman" w:ascii="Times New Roman" w:hAnsi="Times New Roman" w:eastAsia="標楷體"/>
-                <w:color w:val="000000"/>
                 <w:sz w:val="28"/>
                 <w:szCs w:val="28"/>
                 <w:lang w:eastAsia="zh-TW"/>
@@ -1319,7 +1226,6 @@
             <w:r>
               <w:rPr>
                 <w:rFonts w:cs="Times New Roman" w:ascii="Times New Roman" w:hAnsi="Times New Roman" w:eastAsia="標楷體"/>
-                <w:color w:val="000000"/>
                 <w:sz w:val="28"/>
                 <w:szCs w:val="28"/>
                 <w:lang w:eastAsia="zh-TW"/>
@@ -1329,7 +1235,6 @@
             <w:r>
               <w:rPr>
                 <w:rFonts w:cs="Times New Roman" w:ascii="Times New Roman" w:hAnsi="Times New Roman" w:eastAsia="標楷體"/>
-                <w:color w:val="000000"/>
                 <w:sz w:val="28"/>
                 <w:szCs w:val="28"/>
                 <w:lang w:eastAsia="zh-TW"/>
@@ -1339,7 +1244,6 @@
             <w:r>
               <w:rPr>
                 <w:rFonts w:cs="Times New Roman" w:ascii="Times New Roman" w:hAnsi="Times New Roman" w:eastAsia="標楷體"/>
-                <w:color w:val="000000"/>
                 <w:sz w:val="28"/>
                 <w:szCs w:val="28"/>
                 <w:lang w:eastAsia="zh-TW"/>
@@ -1349,7 +1253,6 @@
             <w:r>
               <w:rPr>
                 <w:rFonts w:cs="Times New Roman" w:ascii="Times New Roman" w:hAnsi="Times New Roman" w:eastAsia="標楷體"/>
-                <w:color w:val="000000"/>
                 <w:sz w:val="28"/>
                 <w:szCs w:val="28"/>
                 <w:lang w:eastAsia="zh-TW"/>
@@ -1359,7 +1262,6 @@
             <w:r>
               <w:rPr>
                 <w:rFonts w:cs="Times New Roman" w:ascii="Times New Roman" w:hAnsi="Times New Roman" w:eastAsia="標楷體"/>
-                <w:color w:val="000000"/>
                 <w:sz w:val="28"/>
                 <w:szCs w:val="28"/>
                 <w:lang w:eastAsia="zh-TW"/>
@@ -1369,7 +1271,6 @@
             <w:r>
               <w:rPr>
                 <w:rFonts w:cs="Times New Roman" w:ascii="Times New Roman" w:hAnsi="Times New Roman" w:eastAsia="標楷體"/>
-                <w:color w:val="000000"/>
                 <w:sz w:val="28"/>
                 <w:szCs w:val="28"/>
                 <w:lang w:eastAsia="zh-TW"/>
@@ -1379,7 +1280,6 @@
             <w:r>
               <w:rPr>
                 <w:rFonts w:cs="Times New Roman" w:ascii="Times New Roman" w:hAnsi="Times New Roman" w:eastAsia="標楷體"/>
-                <w:color w:val="000000"/>
                 <w:sz w:val="28"/>
                 <w:szCs w:val="28"/>
                 <w:lang w:eastAsia="zh-TW"/>
@@ -1389,7 +1289,6 @@
             <w:r>
               <w:rPr>
                 <w:rFonts w:cs="Times New Roman" w:ascii="Times New Roman" w:hAnsi="Times New Roman" w:eastAsia="標楷體"/>
-                <w:color w:val="000000"/>
                 <w:sz w:val="28"/>
                 <w:szCs w:val="28"/>
                 <w:lang w:eastAsia="zh-TW"/>
@@ -1399,7 +1298,6 @@
             <w:r>
               <w:rPr>
                 <w:rFonts w:cs="Times New Roman" w:ascii="Times New Roman" w:hAnsi="Times New Roman" w:eastAsia="標楷體"/>
-                <w:color w:val="000000"/>
                 <w:sz w:val="28"/>
                 <w:szCs w:val="28"/>
                 <w:lang w:eastAsia="zh-TW"/>
@@ -1427,8 +1325,7 @@
           </w:tcPr>
           <w:p>
             <w:pPr>
-              <w:keepNext w:val="0"/>
-              <w:spacing w:line="240" w:lineRule="auto" w:before="0" w:after="0"/>
+              <w:spacing w:before="0" w:after="0" w:line="240" w:lineRule="auto"/>
               <w:ind w:leftChars="0" w:left="0" w:rightChars="0" w:right="0" w:firstLine="0" w:firstLineChars="0"/>
               <w:jc w:val="center"/>
               <w:rPr>
@@ -1439,7 +1336,6 @@
             <w:r>
               <w:rPr>
                 <w:rFonts w:cs="Times New Roman" w:ascii="Times New Roman" w:hAnsi="Times New Roman" w:eastAsia="標楷體"/>
-                <w:color w:val="000000"/>
                 <w:sz w:val="28"/>
                 <w:szCs w:val="28"/>
               </w:rPr>
@@ -1461,8 +1357,7 @@
           </w:tcPr>
           <w:p>
             <w:pPr>
-              <w:keepNext w:val="0"/>
-              <w:spacing w:line="240" w:lineRule="auto" w:before="0" w:after="0"/>
+              <w:spacing w:before="0" w:after="0" w:line="240" w:lineRule="auto"/>
               <w:ind w:leftChars="0" w:left="0" w:rightChars="0" w:right="0" w:firstLine="0" w:firstLineChars="0"/>
               <w:jc w:val="center"/>
               <w:rPr>
@@ -1474,7 +1369,6 @@
             <w:r>
               <w:rPr>
                 <w:rFonts w:cs="Times New Roman" w:ascii="Times New Roman" w:hAnsi="Times New Roman" w:eastAsia="標楷體"/>
-                <w:color w:val="000000"/>
                 <w:sz w:val="28"/>
                 <w:szCs w:val="28"/>
                 <w:lang w:eastAsia="zh-TW"/>
@@ -1484,7 +1378,6 @@
             <w:r>
               <w:rPr>
                 <w:rFonts w:cs="Times New Roman" w:ascii="Times New Roman" w:hAnsi="Times New Roman" w:eastAsia="標楷體"/>
-                <w:color w:val="000000"/>
                 <w:sz w:val="28"/>
                 <w:szCs w:val="28"/>
                 <w:lang w:eastAsia="zh-TW"/>
@@ -1506,8 +1399,7 @@
           </w:tcPr>
           <w:p>
             <w:pPr>
-              <w:keepNext w:val="0"/>
-              <w:spacing w:line="240" w:lineRule="auto" w:before="0" w:after="0"/>
+              <w:spacing w:before="0" w:after="0" w:line="240" w:lineRule="auto"/>
               <w:ind w:leftChars="0" w:left="0" w:rightChars="0" w:right="0" w:firstLine="0" w:firstLineChars="0"/>
               <w:jc w:val="center"/>
               <w:rPr>
@@ -1519,7 +1411,6 @@
             <w:r>
               <w:rPr>
                 <w:rFonts w:cs="Times New Roman" w:ascii="Times New Roman" w:hAnsi="Times New Roman" w:eastAsia="標楷體"/>
-                <w:color w:val="000000"/>
                 <w:sz w:val="28"/>
                 <w:szCs w:val="28"/>
                 <w:lang w:eastAsia="zh-TW"/>
@@ -1529,7 +1420,6 @@
             <w:r>
               <w:rPr>
                 <w:rFonts w:cs="Times New Roman" w:ascii="Times New Roman" w:hAnsi="Times New Roman" w:eastAsia="標楷體"/>
-                <w:color w:val="000000"/>
                 <w:sz w:val="28"/>
                 <w:szCs w:val="28"/>
                 <w:lang w:eastAsia="zh-TW"/>
@@ -1539,7 +1429,6 @@
             <w:r>
               <w:rPr>
                 <w:rFonts w:cs="Times New Roman" w:ascii="Times New Roman" w:hAnsi="Times New Roman" w:eastAsia="標楷體"/>
-                <w:color w:val="000000"/>
                 <w:sz w:val="28"/>
                 <w:szCs w:val="28"/>
                 <w:lang w:eastAsia="zh-TW"/>
@@ -1549,7 +1438,6 @@
             <w:r>
               <w:rPr>
                 <w:rFonts w:cs="Times New Roman" w:ascii="Times New Roman" w:hAnsi="Times New Roman" w:eastAsia="標楷體"/>
-                <w:color w:val="000000"/>
                 <w:sz w:val="28"/>
                 <w:szCs w:val="28"/>
                 <w:lang w:eastAsia="zh-TW"/>
@@ -1559,7 +1447,6 @@
             <w:r>
               <w:rPr>
                 <w:rFonts w:cs="Times New Roman" w:ascii="Times New Roman" w:hAnsi="Times New Roman" w:eastAsia="標楷體"/>
-                <w:color w:val="000000"/>
                 <w:sz w:val="28"/>
                 <w:szCs w:val="28"/>
                 <w:lang w:eastAsia="zh-TW"/>
@@ -1569,7 +1456,6 @@
             <w:r>
               <w:rPr>
                 <w:rFonts w:cs="Times New Roman" w:ascii="Times New Roman" w:hAnsi="Times New Roman" w:eastAsia="標楷體"/>
-                <w:color w:val="000000"/>
                 <w:sz w:val="28"/>
                 <w:szCs w:val="28"/>
                 <w:lang w:eastAsia="zh-TW"/>
@@ -1579,7 +1465,6 @@
             <w:r>
               <w:rPr>
                 <w:rFonts w:cs="Times New Roman" w:ascii="Times New Roman" w:hAnsi="Times New Roman" w:eastAsia="標楷體"/>
-                <w:color w:val="000000"/>
                 <w:sz w:val="28"/>
                 <w:szCs w:val="28"/>
                 <w:lang w:eastAsia="zh-TW"/>
@@ -1607,8 +1492,7 @@
           </w:tcPr>
           <w:p>
             <w:pPr>
-              <w:keepNext w:val="0"/>
-              <w:spacing w:line="240" w:lineRule="auto" w:before="0" w:after="0"/>
+              <w:spacing w:before="0" w:after="0" w:line="240" w:lineRule="auto"/>
               <w:ind w:leftChars="0" w:left="0" w:rightChars="0" w:right="0" w:firstLine="0" w:firstLineChars="0"/>
               <w:jc w:val="center"/>
               <w:rPr>
@@ -1619,7 +1503,6 @@
             <w:r>
               <w:rPr>
                 <w:rFonts w:cs="Times New Roman" w:ascii="Times New Roman" w:hAnsi="Times New Roman" w:eastAsia="標楷體"/>
-                <w:color w:val="000000"/>
                 <w:sz w:val="28"/>
                 <w:szCs w:val="28"/>
               </w:rPr>
@@ -1640,8 +1523,7 @@
           </w:tcPr>
           <w:p>
             <w:pPr>
-              <w:keepNext w:val="0"/>
-              <w:spacing w:line="240" w:lineRule="auto" w:before="0" w:after="0"/>
+              <w:spacing w:before="0" w:after="0" w:line="240" w:lineRule="auto"/>
               <w:ind w:leftChars="0" w:left="0" w:rightChars="0" w:right="0" w:firstLine="0" w:firstLineChars="0"/>
               <w:jc w:val="center"/>
               <w:rPr>
@@ -1653,7 +1535,6 @@
             <w:r>
               <w:rPr>
                 <w:rFonts w:cs="Times New Roman" w:ascii="Times New Roman" w:hAnsi="Times New Roman" w:eastAsia="標楷體"/>
-                <w:color w:val="000000"/>
                 <w:sz w:val="28"/>
                 <w:szCs w:val="28"/>
                 <w:lang w:eastAsia="zh-TW"/>
@@ -1663,7 +1544,6 @@
             <w:r>
               <w:rPr>
                 <w:rFonts w:cs="Times New Roman" w:ascii="Times New Roman" w:hAnsi="Times New Roman" w:eastAsia="標楷體"/>
-                <w:color w:val="000000"/>
                 <w:sz w:val="28"/>
                 <w:szCs w:val="28"/>
                 <w:lang w:eastAsia="zh-TW"/>
@@ -1685,8 +1565,7 @@
           </w:tcPr>
           <w:p>
             <w:pPr>
-              <w:keepNext w:val="0"/>
-              <w:spacing w:line="240" w:lineRule="auto" w:before="0" w:after="0"/>
+              <w:spacing w:before="0" w:after="0" w:line="240" w:lineRule="auto"/>
               <w:ind w:leftChars="0" w:left="0" w:rightChars="0" w:right="0" w:firstLine="0" w:firstLineChars="0"/>
               <w:jc w:val="center"/>
               <w:rPr>
@@ -1698,7 +1577,6 @@
             <w:r>
               <w:rPr>
                 <w:rFonts w:cs="Times New Roman" w:ascii="Times New Roman" w:hAnsi="Times New Roman" w:eastAsia="標楷體"/>
-                <w:color w:val="000000"/>
                 <w:sz w:val="28"/>
                 <w:szCs w:val="28"/>
                 <w:lang w:eastAsia="zh-TW"/>
@@ -1708,7 +1586,6 @@
             <w:r>
               <w:rPr>
                 <w:rFonts w:cs="Times New Roman" w:ascii="Times New Roman" w:hAnsi="Times New Roman" w:eastAsia="標楷體"/>
-                <w:color w:val="000000"/>
                 <w:sz w:val="28"/>
                 <w:szCs w:val="28"/>
                 <w:lang w:eastAsia="zh-TW"/>
@@ -1718,7 +1595,6 @@
             <w:r>
               <w:rPr>
                 <w:rFonts w:cs="Times New Roman" w:ascii="Times New Roman" w:hAnsi="Times New Roman" w:eastAsia="標楷體"/>
-                <w:color w:val="000000"/>
                 <w:sz w:val="28"/>
                 <w:szCs w:val="28"/>
                 <w:lang w:eastAsia="zh-TW"/>
@@ -1728,7 +1604,6 @@
             <w:r>
               <w:rPr>
                 <w:rFonts w:cs="Times New Roman" w:ascii="Times New Roman" w:hAnsi="Times New Roman" w:eastAsia="標楷體"/>
-                <w:color w:val="000000"/>
                 <w:sz w:val="28"/>
                 <w:szCs w:val="28"/>
                 <w:lang w:eastAsia="zh-TW"/>
@@ -1738,7 +1613,6 @@
             <w:r>
               <w:rPr>
                 <w:rFonts w:cs="Times New Roman" w:ascii="Times New Roman" w:hAnsi="Times New Roman" w:eastAsia="標楷體"/>
-                <w:color w:val="000000"/>
                 <w:sz w:val="28"/>
                 <w:szCs w:val="28"/>
                 <w:lang w:eastAsia="zh-TW"/>
@@ -1748,7 +1622,6 @@
             <w:r>
               <w:rPr>
                 <w:rFonts w:cs="Times New Roman" w:ascii="Times New Roman" w:hAnsi="Times New Roman" w:eastAsia="標楷體"/>
-                <w:color w:val="000000"/>
                 <w:sz w:val="28"/>
                 <w:szCs w:val="28"/>
                 <w:lang w:eastAsia="zh-TW"/>
@@ -1758,7 +1631,6 @@
             <w:r>
               <w:rPr>
                 <w:rFonts w:cs="Times New Roman" w:ascii="Times New Roman" w:hAnsi="Times New Roman" w:eastAsia="標楷體"/>
-                <w:color w:val="000000"/>
                 <w:sz w:val="28"/>
                 <w:szCs w:val="28"/>
                 <w:lang w:eastAsia="zh-TW"/>
@@ -1786,8 +1658,7 @@
           </w:tcPr>
           <w:p>
             <w:pPr>
-              <w:keepNext w:val="0"/>
-              <w:spacing w:line="240" w:lineRule="auto" w:before="0" w:after="0"/>
+              <w:spacing w:before="0" w:after="0" w:line="240" w:lineRule="auto"/>
               <w:ind w:leftChars="0" w:left="0" w:rightChars="0" w:right="0" w:firstLine="0" w:firstLineChars="0"/>
               <w:jc w:val="center"/>
               <w:rPr>
@@ -1798,7 +1669,6 @@
             <w:r>
               <w:rPr>
                 <w:rFonts w:cs="Times New Roman" w:ascii="Times New Roman" w:hAnsi="Times New Roman" w:eastAsia="標楷體"/>
-                <w:color w:val="000000"/>
                 <w:sz w:val="28"/>
                 <w:szCs w:val="28"/>
               </w:rPr>
@@ -1819,8 +1689,7 @@
           </w:tcPr>
           <w:p>
             <w:pPr>
-              <w:keepNext w:val="0"/>
-              <w:spacing w:line="240" w:lineRule="auto" w:before="0" w:after="0"/>
+              <w:spacing w:before="0" w:after="0" w:line="240" w:lineRule="auto"/>
               <w:ind w:leftChars="0" w:left="0" w:rightChars="0" w:right="0" w:firstLine="0" w:firstLineChars="0"/>
               <w:jc w:val="center"/>
               <w:rPr>
@@ -1832,7 +1701,6 @@
             <w:r>
               <w:rPr>
                 <w:rFonts w:cs="Times New Roman" w:ascii="Times New Roman" w:hAnsi="Times New Roman" w:eastAsia="標楷體"/>
-                <w:color w:val="000000"/>
                 <w:sz w:val="28"/>
                 <w:szCs w:val="28"/>
                 <w:lang w:eastAsia="zh-TW"/>
@@ -1854,8 +1722,7 @@
           </w:tcPr>
           <w:p>
             <w:pPr>
-              <w:keepNext w:val="0"/>
-              <w:spacing w:line="240" w:lineRule="auto" w:before="0" w:after="0"/>
+              <w:spacing w:before="0" w:after="0" w:line="240" w:lineRule="auto"/>
               <w:ind w:leftChars="0" w:left="0" w:rightChars="0" w:right="0" w:firstLine="0" w:firstLineChars="0"/>
               <w:jc w:val="center"/>
               <w:rPr>
@@ -1867,7 +1734,6 @@
             <w:r>
               <w:rPr>
                 <w:rFonts w:cs="Times New Roman" w:ascii="Times New Roman" w:hAnsi="Times New Roman" w:eastAsia="標楷體"/>
-                <w:color w:val="000000"/>
                 <w:sz w:val="28"/>
                 <w:szCs w:val="28"/>
                 <w:lang w:eastAsia="zh-TW"/>
@@ -1877,7 +1743,6 @@
             <w:r>
               <w:rPr>
                 <w:rFonts w:cs="Times New Roman" w:ascii="Times New Roman" w:hAnsi="Times New Roman" w:eastAsia="標楷體"/>
-                <w:color w:val="000000"/>
                 <w:sz w:val="28"/>
                 <w:szCs w:val="28"/>
                 <w:lang w:eastAsia="zh-TW"/>
@@ -1887,7 +1752,6 @@
             <w:r>
               <w:rPr>
                 <w:rFonts w:cs="Times New Roman" w:ascii="Times New Roman" w:hAnsi="Times New Roman" w:eastAsia="標楷體"/>
-                <w:color w:val="000000"/>
                 <w:sz w:val="28"/>
                 <w:szCs w:val="28"/>
                 <w:lang w:eastAsia="zh-TW"/>
@@ -1897,7 +1761,6 @@
             <w:r>
               <w:rPr>
                 <w:rFonts w:cs="Times New Roman" w:ascii="Times New Roman" w:hAnsi="Times New Roman" w:eastAsia="標楷體"/>
-                <w:color w:val="000000"/>
                 <w:sz w:val="28"/>
                 <w:szCs w:val="28"/>
                 <w:lang w:eastAsia="zh-TW"/>
@@ -1907,7 +1770,6 @@
             <w:r>
               <w:rPr>
                 <w:rFonts w:cs="Times New Roman" w:ascii="Times New Roman" w:hAnsi="Times New Roman" w:eastAsia="標楷體"/>
-                <w:color w:val="000000"/>
                 <w:sz w:val="28"/>
                 <w:szCs w:val="28"/>
                 <w:lang w:eastAsia="zh-TW"/>
@@ -1917,7 +1779,6 @@
             <w:r>
               <w:rPr>
                 <w:rFonts w:cs="Times New Roman" w:ascii="Times New Roman" w:hAnsi="Times New Roman" w:eastAsia="標楷體"/>
-                <w:color w:val="000000"/>
                 <w:sz w:val="28"/>
                 <w:szCs w:val="28"/>
                 <w:lang w:eastAsia="zh-TW"/>
@@ -1927,7 +1788,6 @@
             <w:r>
               <w:rPr>
                 <w:rFonts w:cs="Times New Roman" w:ascii="Times New Roman" w:hAnsi="Times New Roman" w:eastAsia="標楷體"/>
-                <w:color w:val="000000"/>
                 <w:sz w:val="28"/>
                 <w:szCs w:val="28"/>
                 <w:lang w:eastAsia="zh-TW"/>
@@ -1937,7 +1797,6 @@
             <w:r>
               <w:rPr>
                 <w:rFonts w:cs="Times New Roman" w:ascii="Times New Roman" w:hAnsi="Times New Roman" w:eastAsia="標楷體"/>
-                <w:color w:val="000000"/>
                 <w:sz w:val="28"/>
                 <w:szCs w:val="28"/>
                 <w:lang w:eastAsia="zh-TW"/>
@@ -1965,8 +1824,7 @@
           </w:tcPr>
           <w:p>
             <w:pPr>
-              <w:keepNext w:val="0"/>
-              <w:spacing w:line="240" w:lineRule="auto" w:before="0" w:after="0"/>
+              <w:spacing w:before="0" w:after="0" w:line="240" w:lineRule="auto"/>
               <w:ind w:leftChars="0" w:left="0" w:rightChars="0" w:right="0" w:firstLine="0" w:firstLineChars="0"/>
               <w:jc w:val="center"/>
               <w:rPr>
@@ -1977,7 +1835,6 @@
             <w:r>
               <w:rPr>
                 <w:rFonts w:cs="Times New Roman" w:ascii="Times New Roman" w:hAnsi="Times New Roman" w:eastAsia="標楷體"/>
-                <w:color w:val="000000"/>
                 <w:sz w:val="28"/>
                 <w:szCs w:val="28"/>
               </w:rPr>
@@ -1998,8 +1855,7 @@
           </w:tcPr>
           <w:p>
             <w:pPr>
-              <w:keepNext w:val="0"/>
-              <w:spacing w:line="240" w:lineRule="auto" w:before="0" w:after="0"/>
+              <w:spacing w:before="0" w:after="0" w:line="240" w:lineRule="auto"/>
               <w:ind w:leftChars="0" w:left="0" w:rightChars="0" w:right="0" w:firstLine="0" w:firstLineChars="0"/>
               <w:jc w:val="center"/>
               <w:rPr>
@@ -2011,7 +1867,6 @@
             <w:r>
               <w:rPr>
                 <w:rFonts w:cs="Times New Roman" w:ascii="Times New Roman" w:hAnsi="Times New Roman" w:eastAsia="標楷體"/>
-                <w:color w:val="000000"/>
                 <w:sz w:val="28"/>
                 <w:szCs w:val="28"/>
                 <w:lang w:eastAsia="zh-TW"/>
@@ -2021,7 +1876,6 @@
             <w:r>
               <w:rPr>
                 <w:rFonts w:cs="Times New Roman" w:ascii="Times New Roman" w:hAnsi="Times New Roman" w:eastAsia="標楷體"/>
-                <w:color w:val="000000"/>
                 <w:sz w:val="28"/>
                 <w:szCs w:val="28"/>
                 <w:lang w:eastAsia="zh-TW"/>
@@ -2043,8 +1897,7 @@
           </w:tcPr>
           <w:p>
             <w:pPr>
-              <w:keepNext w:val="0"/>
-              <w:spacing w:line="240" w:lineRule="auto" w:before="0" w:after="0"/>
+              <w:spacing w:before="0" w:after="0" w:line="240" w:lineRule="auto"/>
               <w:ind w:leftChars="0" w:left="0" w:rightChars="0" w:right="0" w:firstLine="0" w:firstLineChars="0"/>
               <w:jc w:val="center"/>
               <w:rPr>
@@ -2056,7 +1909,6 @@
             <w:r>
               <w:rPr>
                 <w:rFonts w:cs="Times New Roman" w:ascii="Times New Roman" w:hAnsi="Times New Roman" w:eastAsia="標楷體"/>
-                <w:color w:val="000000"/>
                 <w:sz w:val="28"/>
                 <w:szCs w:val="28"/>
                 <w:lang w:eastAsia="zh-TW"/>
@@ -2066,7 +1918,6 @@
             <w:r>
               <w:rPr>
                 <w:rFonts w:cs="Times New Roman" w:ascii="Times New Roman" w:hAnsi="Times New Roman" w:eastAsia="標楷體"/>
-                <w:color w:val="000000"/>
                 <w:sz w:val="28"/>
                 <w:szCs w:val="28"/>
                 <w:lang w:eastAsia="zh-TW"/>
@@ -2076,7 +1927,6 @@
             <w:r>
               <w:rPr>
                 <w:rFonts w:cs="Times New Roman" w:ascii="Times New Roman" w:hAnsi="Times New Roman" w:eastAsia="標楷體"/>
-                <w:color w:val="000000"/>
                 <w:sz w:val="28"/>
                 <w:szCs w:val="28"/>
                 <w:lang w:eastAsia="zh-TW"/>
@@ -2086,7 +1936,6 @@
             <w:r>
               <w:rPr>
                 <w:rFonts w:cs="Times New Roman" w:ascii="Times New Roman" w:hAnsi="Times New Roman" w:eastAsia="標楷體"/>
-                <w:color w:val="000000"/>
                 <w:sz w:val="28"/>
                 <w:szCs w:val="28"/>
                 <w:lang w:eastAsia="zh-TW"/>
@@ -2096,7 +1945,6 @@
             <w:r>
               <w:rPr>
                 <w:rFonts w:cs="Times New Roman" w:ascii="Times New Roman" w:hAnsi="Times New Roman" w:eastAsia="標楷體"/>
-                <w:color w:val="000000"/>
                 <w:sz w:val="28"/>
                 <w:szCs w:val="28"/>
                 <w:lang w:eastAsia="zh-TW"/>
@@ -2106,7 +1954,6 @@
             <w:r>
               <w:rPr>
                 <w:rFonts w:cs="Times New Roman" w:ascii="Times New Roman" w:hAnsi="Times New Roman" w:eastAsia="標楷體"/>
-                <w:color w:val="000000"/>
                 <w:sz w:val="28"/>
                 <w:szCs w:val="28"/>
                 <w:lang w:eastAsia="zh-TW"/>
@@ -2116,7 +1963,6 @@
             <w:r>
               <w:rPr>
                 <w:rFonts w:cs="Times New Roman" w:ascii="Times New Roman" w:hAnsi="Times New Roman" w:eastAsia="標楷體"/>
-                <w:color w:val="000000"/>
                 <w:sz w:val="28"/>
                 <w:szCs w:val="28"/>
                 <w:lang w:eastAsia="zh-TW"/>
@@ -2126,7 +1972,6 @@
             <w:r>
               <w:rPr>
                 <w:rFonts w:cs="Times New Roman" w:ascii="Times New Roman" w:hAnsi="Times New Roman" w:eastAsia="標楷體"/>
-                <w:color w:val="000000"/>
                 <w:sz w:val="28"/>
                 <w:szCs w:val="28"/>
                 <w:lang w:eastAsia="zh-TW"/>
@@ -2136,7 +1981,6 @@
             <w:r>
               <w:rPr>
                 <w:rFonts w:cs="Times New Roman" w:ascii="Times New Roman" w:hAnsi="Times New Roman" w:eastAsia="標楷體"/>
-                <w:color w:val="000000"/>
                 <w:sz w:val="28"/>
                 <w:szCs w:val="28"/>
                 <w:lang w:eastAsia="zh-TW"/>
@@ -2146,7 +1990,6 @@
             <w:r>
               <w:rPr>
                 <w:rFonts w:cs="Times New Roman" w:ascii="Times New Roman" w:hAnsi="Times New Roman" w:eastAsia="標楷體"/>
-                <w:color w:val="000000"/>
                 <w:sz w:val="28"/>
                 <w:szCs w:val="28"/>
                 <w:lang w:eastAsia="zh-TW"/>
@@ -2156,7 +1999,6 @@
             <w:r>
               <w:rPr>
                 <w:rFonts w:cs="Times New Roman" w:ascii="Times New Roman" w:hAnsi="Times New Roman" w:eastAsia="標楷體"/>
-                <w:color w:val="000000"/>
                 <w:sz w:val="28"/>
                 <w:szCs w:val="28"/>
                 <w:lang w:eastAsia="zh-TW"/>
@@ -2166,7 +2008,6 @@
             <w:r>
               <w:rPr>
                 <w:rFonts w:cs="Times New Roman" w:ascii="Times New Roman" w:hAnsi="Times New Roman" w:eastAsia="標楷體"/>
-                <w:color w:val="000000"/>
                 <w:sz w:val="28"/>
                 <w:szCs w:val="28"/>
                 <w:lang w:eastAsia="zh-TW"/>
@@ -2176,7 +2017,6 @@
             <w:r>
               <w:rPr>
                 <w:rFonts w:cs="Times New Roman" w:ascii="Times New Roman" w:hAnsi="Times New Roman" w:eastAsia="標楷體"/>
-                <w:color w:val="000000"/>
                 <w:sz w:val="28"/>
                 <w:szCs w:val="28"/>
                 <w:lang w:eastAsia="zh-TW"/>
@@ -2204,8 +2044,7 @@
           </w:tcPr>
           <w:p>
             <w:pPr>
-              <w:keepNext w:val="0"/>
-              <w:spacing w:line="240" w:lineRule="auto" w:before="0" w:after="0"/>
+              <w:spacing w:before="0" w:after="0" w:line="240" w:lineRule="auto"/>
               <w:ind w:leftChars="0" w:left="0" w:rightChars="0" w:right="0" w:firstLine="0" w:firstLineChars="0"/>
               <w:jc w:val="center"/>
               <w:rPr>
@@ -2216,7 +2055,6 @@
             <w:r>
               <w:rPr>
                 <w:rFonts w:cs="Times New Roman" w:ascii="Times New Roman" w:hAnsi="Times New Roman" w:eastAsia="標楷體"/>
-                <w:color w:val="000000"/>
                 <w:sz w:val="28"/>
                 <w:szCs w:val="28"/>
               </w:rPr>
@@ -2237,8 +2075,7 @@
           </w:tcPr>
           <w:p>
             <w:pPr>
-              <w:keepNext w:val="0"/>
-              <w:spacing w:line="240" w:lineRule="auto" w:before="0" w:after="0"/>
+              <w:spacing w:before="0" w:after="0" w:line="240" w:lineRule="auto"/>
               <w:ind w:leftChars="0" w:left="0" w:rightChars="0" w:right="0" w:firstLine="0" w:firstLineChars="0"/>
               <w:jc w:val="center"/>
               <w:rPr>
@@ -2250,7 +2087,6 @@
             <w:r>
               <w:rPr>
                 <w:rFonts w:cs="Times New Roman" w:ascii="Times New Roman" w:hAnsi="Times New Roman" w:eastAsia="標楷體"/>
-                <w:color w:val="000000"/>
                 <w:sz w:val="28"/>
                 <w:szCs w:val="28"/>
                 <w:lang w:eastAsia="zh-TW"/>
@@ -2260,7 +2096,6 @@
             <w:r>
               <w:rPr>
                 <w:rFonts w:cs="Times New Roman" w:ascii="Times New Roman" w:hAnsi="Times New Roman" w:eastAsia="標楷體"/>
-                <w:color w:val="000000"/>
                 <w:sz w:val="28"/>
                 <w:szCs w:val="28"/>
                 <w:lang w:eastAsia="zh-TW"/>
@@ -2282,8 +2117,7 @@
           </w:tcPr>
           <w:p>
             <w:pPr>
-              <w:keepNext w:val="0"/>
-              <w:spacing w:line="240" w:lineRule="auto" w:before="0" w:after="0"/>
+              <w:spacing w:before="0" w:after="0" w:line="240" w:lineRule="auto"/>
               <w:ind w:leftChars="0" w:left="0" w:rightChars="0" w:right="0" w:firstLine="0" w:firstLineChars="0"/>
               <w:jc w:val="center"/>
               <w:rPr>
@@ -2295,7 +2129,6 @@
             <w:r>
               <w:rPr>
                 <w:rFonts w:cs="Times New Roman" w:ascii="Times New Roman" w:hAnsi="Times New Roman" w:eastAsia="標楷體"/>
-                <w:color w:val="000000"/>
                 <w:sz w:val="28"/>
                 <w:szCs w:val="28"/>
                 <w:lang w:eastAsia="zh-TW"/>
@@ -2305,7 +2138,6 @@
             <w:r>
               <w:rPr>
                 <w:rFonts w:cs="Times New Roman" w:ascii="Times New Roman" w:hAnsi="Times New Roman" w:eastAsia="標楷體"/>
-                <w:color w:val="000000"/>
                 <w:sz w:val="28"/>
                 <w:szCs w:val="28"/>
                 <w:lang w:eastAsia="zh-TW"/>
@@ -2315,7 +2147,6 @@
             <w:r>
               <w:rPr>
                 <w:rFonts w:cs="Times New Roman" w:ascii="Times New Roman" w:hAnsi="Times New Roman" w:eastAsia="標楷體"/>
-                <w:color w:val="000000"/>
                 <w:sz w:val="28"/>
                 <w:szCs w:val="28"/>
                 <w:lang w:eastAsia="zh-TW"/>
@@ -2325,7 +2156,6 @@
             <w:r>
               <w:rPr>
                 <w:rFonts w:cs="Times New Roman" w:ascii="Times New Roman" w:hAnsi="Times New Roman" w:eastAsia="標楷體"/>
-                <w:color w:val="000000"/>
                 <w:sz w:val="28"/>
                 <w:szCs w:val="28"/>
                 <w:lang w:eastAsia="zh-TW"/>
@@ -2335,7 +2165,6 @@
             <w:r>
               <w:rPr>
                 <w:rFonts w:cs="Times New Roman" w:ascii="Times New Roman" w:hAnsi="Times New Roman" w:eastAsia="標楷體"/>
-                <w:color w:val="000000"/>
                 <w:sz w:val="28"/>
                 <w:szCs w:val="28"/>
                 <w:lang w:eastAsia="zh-TW"/>
@@ -2345,7 +2174,6 @@
             <w:r>
               <w:rPr>
                 <w:rFonts w:cs="Times New Roman" w:ascii="Times New Roman" w:hAnsi="Times New Roman" w:eastAsia="標楷體"/>
-                <w:color w:val="000000"/>
                 <w:sz w:val="28"/>
                 <w:szCs w:val="28"/>
                 <w:lang w:eastAsia="zh-TW"/>
@@ -2355,7 +2183,6 @@
             <w:r>
               <w:rPr>
                 <w:rFonts w:cs="Times New Roman" w:ascii="Times New Roman" w:hAnsi="Times New Roman" w:eastAsia="標楷體"/>
-                <w:color w:val="000000"/>
                 <w:sz w:val="28"/>
                 <w:szCs w:val="28"/>
                 <w:lang w:eastAsia="zh-TW"/>
@@ -2365,7 +2192,6 @@
             <w:r>
               <w:rPr>
                 <w:rFonts w:cs="Times New Roman" w:ascii="Times New Roman" w:hAnsi="Times New Roman" w:eastAsia="標楷體"/>
-                <w:color w:val="000000"/>
                 <w:sz w:val="28"/>
                 <w:szCs w:val="28"/>
                 <w:lang w:eastAsia="zh-TW"/>
@@ -2375,7 +2201,6 @@
             <w:r>
               <w:rPr>
                 <w:rFonts w:cs="Times New Roman" w:ascii="Times New Roman" w:hAnsi="Times New Roman" w:eastAsia="標楷體"/>
-                <w:color w:val="000000"/>
                 <w:sz w:val="28"/>
                 <w:szCs w:val="28"/>
                 <w:lang w:eastAsia="zh-TW"/>
@@ -2385,7 +2210,6 @@
             <w:r>
               <w:rPr>
                 <w:rFonts w:cs="Times New Roman" w:ascii="Times New Roman" w:hAnsi="Times New Roman" w:eastAsia="標楷體"/>
-                <w:color w:val="000000"/>
                 <w:sz w:val="28"/>
                 <w:szCs w:val="28"/>
                 <w:lang w:eastAsia="zh-TW"/>
@@ -2395,7 +2219,6 @@
             <w:r>
               <w:rPr>
                 <w:rFonts w:cs="Times New Roman" w:ascii="Times New Roman" w:hAnsi="Times New Roman" w:eastAsia="標楷體"/>
-                <w:color w:val="000000"/>
                 <w:sz w:val="28"/>
                 <w:szCs w:val="28"/>
                 <w:lang w:eastAsia="zh-TW"/>
@@ -2405,7 +2228,6 @@
             <w:r>
               <w:rPr>
                 <w:rFonts w:cs="Times New Roman" w:ascii="Times New Roman" w:hAnsi="Times New Roman" w:eastAsia="標楷體"/>
-                <w:color w:val="000000"/>
                 <w:sz w:val="28"/>
                 <w:szCs w:val="28"/>
                 <w:lang w:eastAsia="zh-TW"/>
@@ -2415,7 +2237,6 @@
             <w:r>
               <w:rPr>
                 <w:rFonts w:cs="Times New Roman" w:ascii="Times New Roman" w:hAnsi="Times New Roman" w:eastAsia="標楷體"/>
-                <w:color w:val="000000"/>
                 <w:sz w:val="28"/>
                 <w:szCs w:val="28"/>
                 <w:lang w:eastAsia="zh-TW"/>
@@ -2425,7 +2246,6 @@
             <w:r>
               <w:rPr>
                 <w:rFonts w:cs="Times New Roman" w:ascii="Times New Roman" w:hAnsi="Times New Roman" w:eastAsia="標楷體"/>
-                <w:color w:val="000000"/>
                 <w:sz w:val="28"/>
                 <w:szCs w:val="28"/>
                 <w:lang w:eastAsia="zh-TW"/>
@@ -2435,7 +2255,6 @@
             <w:r>
               <w:rPr>
                 <w:rFonts w:cs="Times New Roman" w:ascii="Times New Roman" w:hAnsi="Times New Roman" w:eastAsia="標楷體"/>
-                <w:color w:val="000000"/>
                 <w:sz w:val="28"/>
                 <w:szCs w:val="28"/>
                 <w:lang w:eastAsia="zh-TW"/>
@@ -2445,7 +2264,6 @@
             <w:r>
               <w:rPr>
                 <w:rFonts w:cs="Times New Roman" w:ascii="Times New Roman" w:hAnsi="Times New Roman" w:eastAsia="標楷體"/>
-                <w:color w:val="000000"/>
                 <w:sz w:val="28"/>
                 <w:szCs w:val="28"/>
                 <w:lang w:eastAsia="zh-TW"/>
@@ -2455,7 +2273,6 @@
             <w:r>
               <w:rPr>
                 <w:rFonts w:cs="Times New Roman" w:ascii="Times New Roman" w:hAnsi="Times New Roman" w:eastAsia="標楷體"/>
-                <w:color w:val="000000"/>
                 <w:sz w:val="28"/>
                 <w:szCs w:val="28"/>
                 <w:lang w:eastAsia="zh-TW"/>
@@ -2465,7 +2282,6 @@
             <w:r>
               <w:rPr>
                 <w:rFonts w:cs="Times New Roman" w:ascii="Times New Roman" w:hAnsi="Times New Roman" w:eastAsia="標楷體"/>
-                <w:color w:val="000000"/>
                 <w:sz w:val="28"/>
                 <w:szCs w:val="28"/>
                 <w:lang w:eastAsia="zh-TW"/>
@@ -2492,15 +2308,13 @@
           </w:tcPr>
           <w:p>
             <w:pPr>
-              <w:keepNext w:val="0"/>
-              <w:spacing w:line="240" w:lineRule="auto" w:before="0" w:after="0"/>
-              <w:ind w:leftChars="0" w:left="0" w:rightChars="0" w:right="0" w:firstLine="0" w:firstLineChars="0"/>
-              <w:snapToGrid w:val="0"/>
-            </w:pPr>
-            <w:r>
-              <w:rPr>
-                <w:rFonts w:cs="Times New Roman" w:ascii="Times New Roman" w:hAnsi="Times New Roman" w:eastAsia="標楷體"/>
-                <w:color w:val="000000"/>
+              <w:spacing w:before="0" w:after="0" w:line="240" w:lineRule="auto"/>
+              <w:ind w:leftChars="0" w:left="0" w:rightChars="0" w:right="0" w:firstLine="0" w:firstLineChars="0"/>
+              <w:snapToGrid w:val="0"/>
+            </w:pPr>
+            <w:r>
+              <w:rPr>
+                <w:rFonts w:cs="Times New Roman" w:ascii="Times New Roman" w:hAnsi="Times New Roman" w:eastAsia="標楷體"/>
                 <w:sz w:val="28"/>
               </w:rPr>
               <w:t>12</w:t>
@@ -2520,15 +2334,13 @@
           </w:tcPr>
           <w:p>
             <w:pPr>
-              <w:keepNext w:val="0"/>
-              <w:spacing w:line="240" w:lineRule="auto" w:before="0" w:after="0"/>
-              <w:ind w:leftChars="0" w:left="0" w:rightChars="0" w:right="0" w:firstLine="0" w:firstLineChars="0"/>
-              <w:snapToGrid w:val="0"/>
-            </w:pPr>
-            <w:r>
-              <w:rPr>
-                <w:rFonts w:cs="Times New Roman" w:ascii="Times New Roman" w:hAnsi="Times New Roman" w:eastAsia="標楷體"/>
-                <w:color w:val="000000"/>
+              <w:spacing w:before="0" w:after="0" w:line="240" w:lineRule="auto"/>
+              <w:ind w:leftChars="0" w:left="0" w:rightChars="0" w:right="0" w:firstLine="0" w:firstLineChars="0"/>
+              <w:snapToGrid w:val="0"/>
+            </w:pPr>
+            <w:r>
+              <w:rPr>
+                <w:rFonts w:cs="Times New Roman" w:ascii="Times New Roman" w:hAnsi="Times New Roman" w:eastAsia="標楷體"/>
                 <w:sz w:val="28"/>
               </w:rPr>
               <w:t>國立臺北商業大學資訊管理系</w:t>
@@ -2548,15 +2360,13 @@
           </w:tcPr>
           <w:p>
             <w:pPr>
-              <w:keepNext w:val="0"/>
-              <w:spacing w:line="240" w:lineRule="auto" w:before="0" w:after="0"/>
-              <w:ind w:leftChars="0" w:left="0" w:rightChars="0" w:right="0" w:firstLine="0" w:firstLineChars="0"/>
-              <w:snapToGrid w:val="0"/>
-            </w:pPr>
-            <w:r>
-              <w:rPr>
-                <w:rFonts w:cs="Times New Roman" w:ascii="Times New Roman" w:hAnsi="Times New Roman" w:eastAsia="標楷體"/>
-                <w:color w:val="000000"/>
+              <w:spacing w:before="0" w:after="0" w:line="240" w:lineRule="auto"/>
+              <w:ind w:leftChars="0" w:left="0" w:rightChars="0" w:right="0" w:firstLine="0" w:firstLineChars="0"/>
+              <w:snapToGrid w:val="0"/>
+            </w:pPr>
+            <w:r>
+              <w:rPr>
+                <w:rFonts w:cs="Times New Roman" w:ascii="Times New Roman" w:hAnsi="Times New Roman" w:eastAsia="標楷體"/>
                 <w:sz w:val="28"/>
               </w:rPr>
               <w:t xml:space="preserve">115-1 </w:t>
@@ -2564,7 +2374,6 @@
             <w:r>
               <w:rPr>
                 <w:rFonts w:cs="Times New Roman" w:ascii="Times New Roman" w:hAnsi="Times New Roman" w:eastAsia="標楷體"/>
-                <w:color w:val="000000"/>
                 <w:sz w:val="28"/>
               </w:rPr>
               <w:t>專題公告及系統手冊、繳件與時程附件。查閱日期：</w:t>
@@ -2572,7 +2381,6 @@
             <w:r>
               <w:rPr>
                 <w:rFonts w:cs="Times New Roman" w:ascii="Times New Roman" w:hAnsi="Times New Roman" w:eastAsia="標楷體"/>
-                <w:color w:val="000000"/>
                 <w:sz w:val="28"/>
               </w:rPr>
               <w:t>2026-10-04</w:t>
@@ -2580,7 +2388,6 @@
             <w:r>
               <w:rPr>
                 <w:rFonts w:cs="Times New Roman" w:ascii="Times New Roman" w:hAnsi="Times New Roman" w:eastAsia="標楷體"/>
-                <w:color w:val="000000"/>
                 <w:sz w:val="28"/>
               </w:rPr>
               <w:t>。</w:t>
@@ -2588,7 +2395,6 @@
             <w:r>
               <w:rPr>
                 <w:rFonts w:cs="Times New Roman" w:ascii="Times New Roman" w:hAnsi="Times New Roman" w:eastAsia="標楷體"/>
-                <w:color w:val="000000"/>
                 <w:sz w:val="28"/>
               </w:rPr>
               <w:t>https://imd.ntub.edu.tw/p/405-1043-119996,c2825.php?Lang=zh-tw</w:t>
@@ -2673,7 +2479,6 @@
         <w:trPr>
           <w:cantSplit/>
           <w:tblHeader/>
-          <w:tblHeader/>
         </w:trPr>
         <w:tc>
           <w:tcPr>
@@ -2688,8 +2493,7 @@
           </w:tcPr>
           <w:p>
             <w:pPr>
-              <w:keepNext w:val="0"/>
-              <w:spacing w:line="240" w:lineRule="auto" w:before="0" w:after="0"/>
+              <w:spacing w:before="0" w:after="0" w:line="240" w:lineRule="auto"/>
               <w:ind w:leftChars="0" w:left="0" w:rightChars="0" w:right="0" w:firstLine="0" w:firstLineChars="0"/>
               <w:jc w:val="center"/>
               <w:rPr>
@@ -2700,7 +2504,6 @@
             <w:r>
               <w:rPr>
                 <w:rFonts w:cs="Times New Roman" w:hint="eastAsia" w:ascii="Times New Roman" w:hAnsi="Times New Roman" w:eastAsia="標楷體"/>
-                <w:color w:val="000000"/>
                 <w:sz w:val="28"/>
                 <w:lang w:eastAsia="zh-TW"/>
               </w:rPr>
@@ -2721,8 +2524,7 @@
           </w:tcPr>
           <w:p>
             <w:pPr>
-              <w:keepNext w:val="0"/>
-              <w:spacing w:line="240" w:lineRule="auto" w:before="0" w:after="0"/>
+              <w:spacing w:before="0" w:after="0" w:line="240" w:lineRule="auto"/>
               <w:ind w:leftChars="0" w:left="0" w:rightChars="0" w:right="0" w:firstLine="0" w:firstLineChars="0"/>
               <w:jc w:val="center"/>
               <w:rPr>
@@ -2733,7 +2535,6 @@
             <w:r>
               <w:rPr>
                 <w:rFonts w:cs="Times New Roman" w:hint="eastAsia" w:ascii="Times New Roman" w:hAnsi="Times New Roman" w:eastAsia="標楷體"/>
-                <w:color w:val="000000"/>
                 <w:sz w:val="28"/>
                 <w:lang w:eastAsia="zh-TW"/>
               </w:rPr>
@@ -2754,8 +2555,7 @@
           </w:tcPr>
           <w:p>
             <w:pPr>
-              <w:keepNext w:val="0"/>
-              <w:spacing w:line="240" w:lineRule="auto" w:before="0" w:after="0"/>
+              <w:spacing w:before="0" w:after="0" w:line="240" w:lineRule="auto"/>
               <w:ind w:leftChars="0" w:left="0" w:rightChars="0" w:right="0" w:firstLine="0" w:firstLineChars="0"/>
               <w:jc w:val="center"/>
               <w:rPr>
@@ -2766,7 +2566,6 @@
             <w:r>
               <w:rPr>
                 <w:rFonts w:cs="Times New Roman" w:hint="eastAsia" w:ascii="Times New Roman" w:hAnsi="Times New Roman" w:eastAsia="標楷體"/>
-                <w:color w:val="000000"/>
                 <w:sz w:val="28"/>
                 <w:lang w:eastAsia="zh-TW"/>
               </w:rPr>
@@ -2787,15 +2586,13 @@
           </w:tcPr>
           <w:p>
             <w:pPr>
-              <w:keepNext w:val="0"/>
-              <w:spacing w:line="240" w:lineRule="auto" w:before="0" w:after="0"/>
-              <w:ind w:leftChars="0" w:left="0" w:rightChars="0" w:right="0" w:firstLine="0" w:firstLineChars="0"/>
-              <w:snapToGrid w:val="0"/>
-            </w:pPr>
-            <w:r>
-              <w:rPr>
-                <w:rFonts w:cs="Times New Roman" w:ascii="Times New Roman" w:hAnsi="Times New Roman" w:eastAsia="標楷體"/>
-                <w:color w:val="000000"/>
+              <w:spacing w:before="0" w:after="0" w:line="240" w:lineRule="auto"/>
+              <w:ind w:leftChars="0" w:left="0" w:rightChars="0" w:right="0" w:firstLine="0" w:firstLineChars="0"/>
+              <w:snapToGrid w:val="0"/>
+            </w:pPr>
+            <w:r>
+              <w:rPr>
+                <w:rFonts w:cs="Times New Roman" w:ascii="Times New Roman" w:hAnsi="Times New Roman" w:eastAsia="標楷體"/>
                 <w:sz w:val="28"/>
               </w:rPr>
               <w:t>頁碼及定位</w:t>
@@ -2820,15 +2617,13 @@
           </w:tcPr>
           <w:p>
             <w:pPr>
-              <w:keepNext w:val="0"/>
-              <w:spacing w:line="240" w:lineRule="auto" w:before="0" w:after="0"/>
-              <w:ind w:leftChars="0" w:left="0" w:rightChars="0" w:right="0" w:firstLine="0" w:firstLineChars="0"/>
-              <w:snapToGrid w:val="0"/>
-            </w:pPr>
-            <w:r>
-              <w:rPr>
-                <w:rFonts w:cs="Times New Roman" w:ascii="Times New Roman" w:hAnsi="Times New Roman" w:eastAsia="標楷體"/>
-                <w:color w:val="000000"/>
+              <w:spacing w:before="0" w:after="0" w:line="240" w:lineRule="auto"/>
+              <w:ind w:leftChars="0" w:left="0" w:rightChars="0" w:right="0" w:firstLine="0" w:firstLineChars="0"/>
+              <w:snapToGrid w:val="0"/>
+            </w:pPr>
+            <w:r>
+              <w:rPr>
+                <w:rFonts w:cs="Times New Roman" w:ascii="Times New Roman" w:hAnsi="Times New Roman" w:eastAsia="標楷體"/>
                 <w:sz w:val="28"/>
               </w:rPr>
               <w:t>AI-1</w:t>
@@ -2848,8 +2643,7 @@
           </w:tcPr>
           <w:p>
             <w:pPr>
-              <w:keepNext w:val="0"/>
-              <w:spacing w:line="240" w:lineRule="auto" w:before="0" w:after="0"/>
+              <w:spacing w:before="0" w:after="0" w:line="240" w:lineRule="auto"/>
               <w:ind w:leftChars="0" w:left="0" w:rightChars="0" w:right="0" w:firstLine="0" w:firstLineChars="0"/>
               <w:jc w:val="center"/>
               <w:rPr>
@@ -2860,7 +2654,6 @@
             <w:r>
               <w:rPr>
                 <w:rFonts w:cs="Times New Roman" w:hint="eastAsia" w:ascii="Times New Roman" w:hAnsi="Times New Roman" w:eastAsia="標楷體"/>
-                <w:color w:val="000000"/>
                 <w:sz w:val="28"/>
                 <w:lang w:eastAsia="zh-TW"/>
               </w:rPr>
@@ -2869,7 +2662,6 @@
             <w:r>
               <w:rPr>
                 <w:rFonts w:cs="Times New Roman" w:hint="eastAsia" w:ascii="Times New Roman" w:hAnsi="Times New Roman" w:eastAsia="標楷體"/>
-                <w:color w:val="000000"/>
                 <w:sz w:val="28"/>
                 <w:lang w:eastAsia="zh-TW"/>
               </w:rPr>
@@ -2890,8 +2682,7 @@
           </w:tcPr>
           <w:p>
             <w:pPr>
-              <w:keepNext w:val="0"/>
-              <w:spacing w:line="240" w:lineRule="auto" w:before="0" w:after="0"/>
+              <w:spacing w:before="0" w:after="0" w:line="240" w:lineRule="auto"/>
               <w:ind w:leftChars="0" w:left="0" w:rightChars="0" w:right="0" w:firstLine="0" w:firstLineChars="0"/>
               <w:rPr>
                 <w:lang w:eastAsia="zh-TW"/>
@@ -2901,7 +2692,6 @@
             <w:r>
               <w:rPr>
                 <w:rFonts w:cs="Times New Roman" w:hint="eastAsia" w:ascii="Times New Roman" w:hAnsi="Times New Roman" w:eastAsia="標楷體"/>
-                <w:color w:val="000000"/>
                 <w:sz w:val="28"/>
                 <w:lang w:eastAsia="zh-TW"/>
               </w:rPr>
@@ -2910,7 +2700,6 @@
             <w:r>
               <w:rPr>
                 <w:rFonts w:cs="Times New Roman" w:hint="eastAsia" w:ascii="Times New Roman" w:hAnsi="Times New Roman" w:eastAsia="標楷體"/>
-                <w:color w:val="000000"/>
                 <w:sz w:val="28"/>
                 <w:lang w:eastAsia="zh-TW"/>
               </w:rPr>
@@ -2919,7 +2708,6 @@
             <w:r>
               <w:rPr>
                 <w:rFonts w:cs="Times New Roman" w:hint="eastAsia" w:ascii="Times New Roman" w:hAnsi="Times New Roman" w:eastAsia="標楷體"/>
-                <w:color w:val="000000"/>
                 <w:sz w:val="28"/>
                 <w:lang w:eastAsia="zh-TW"/>
               </w:rPr>
@@ -2928,7 +2716,6 @@
             <w:r>
               <w:rPr>
                 <w:rFonts w:cs="Times New Roman" w:hint="eastAsia" w:ascii="Times New Roman" w:hAnsi="Times New Roman" w:eastAsia="標楷體"/>
-                <w:color w:val="000000"/>
                 <w:sz w:val="28"/>
                 <w:lang w:eastAsia="zh-TW"/>
               </w:rPr>
@@ -2937,7 +2724,6 @@
             <w:r>
               <w:rPr>
                 <w:rFonts w:cs="Times New Roman" w:hint="eastAsia" w:ascii="Times New Roman" w:hAnsi="Times New Roman" w:eastAsia="標楷體"/>
-                <w:color w:val="000000"/>
                 <w:sz w:val="28"/>
                 <w:lang w:eastAsia="zh-TW"/>
               </w:rPr>
@@ -2958,18 +2744,16 @@
           </w:tcPr>
           <w:p>
             <w:pPr>
-              <w:keepNext w:val="0"/>
-              <w:spacing w:line="240" w:lineRule="auto" w:before="0" w:after="0"/>
-              <w:ind w:firstLine="0" w:left="0" w:right="0" w:leftChars="0" w:rightChars="0" w:firstLineChars="0"/>
-              <w:snapToGrid w:val="0"/>
-            </w:pPr>
-            <w:r>
-              <w:rPr>
-                <w:rFonts w:ascii="Times New Roman" w:hAnsi="Times New Roman" w:eastAsia="標楷體" w:cs="Times New Roman"/>
-                <w:color w:val="000000"/>
-                <w:sz w:val="28"/>
-              </w:rPr>
-              <w:t>定位章節起頁：1章 p.7；3章 p.13；5章 p.21；6章 p.43；7章 p.45；8章 p.53；11章 p.69；12章 p.72</w:t>
+              <w:spacing w:before="0" w:after="0" w:line="240" w:lineRule="auto"/>
+              <w:ind w:left="0" w:right="0" w:firstLine="0" w:leftChars="0" w:rightChars="0" w:firstLineChars="0"/>
+              <w:snapToGrid w:val="0"/>
+            </w:pPr>
+            <w:r>
+              <w:rPr>
+                <w:rFonts w:ascii="Times New Roman" w:hAnsi="Times New Roman" w:eastAsia="標楷體"/>
+                <w:sz w:val="28"/>
+              </w:rPr>
+              <w:t>1章 p.7；3章 p.13；5章 p.22；6章 p.45；7章 p.47；8章 p.55；11章 p.72；12章 p.75</w:t>
             </w:r>
           </w:p>
         </w:tc>
@@ -2991,15 +2775,13 @@
           </w:tcPr>
           <w:p>
             <w:pPr>
-              <w:keepNext w:val="0"/>
-              <w:spacing w:line="240" w:lineRule="auto" w:before="0" w:after="0"/>
-              <w:ind w:leftChars="0" w:left="0" w:rightChars="0" w:right="0" w:firstLine="0" w:firstLineChars="0"/>
-              <w:snapToGrid w:val="0"/>
-            </w:pPr>
-            <w:r>
-              <w:rPr>
-                <w:rFonts w:cs="Times New Roman" w:ascii="Times New Roman" w:hAnsi="Times New Roman" w:eastAsia="標楷體"/>
-                <w:color w:val="000000"/>
+              <w:spacing w:before="0" w:after="0" w:line="240" w:lineRule="auto"/>
+              <w:ind w:leftChars="0" w:left="0" w:rightChars="0" w:right="0" w:firstLine="0" w:firstLineChars="0"/>
+              <w:snapToGrid w:val="0"/>
+            </w:pPr>
+            <w:r>
+              <w:rPr>
+                <w:rFonts w:cs="Times New Roman" w:ascii="Times New Roman" w:hAnsi="Times New Roman" w:eastAsia="標楷體"/>
                 <w:sz w:val="28"/>
               </w:rPr>
               <w:t>AI-2</w:t>
@@ -3019,8 +2801,7 @@
           </w:tcPr>
           <w:p>
             <w:pPr>
-              <w:keepNext w:val="0"/>
-              <w:spacing w:line="240" w:lineRule="auto" w:before="0" w:after="0"/>
+              <w:spacing w:before="0" w:after="0" w:line="240" w:lineRule="auto"/>
               <w:ind w:leftChars="0" w:left="0" w:rightChars="0" w:right="0" w:firstLine="0" w:firstLineChars="0"/>
               <w:jc w:val="center"/>
               <w:rPr>
@@ -3031,7 +2812,6 @@
             <w:r>
               <w:rPr>
                 <w:rFonts w:cs="Times New Roman" w:hint="eastAsia" w:ascii="Times New Roman" w:hAnsi="Times New Roman" w:eastAsia="標楷體"/>
-                <w:color w:val="000000"/>
                 <w:sz w:val="28"/>
                 <w:lang w:eastAsia="zh-TW"/>
               </w:rPr>
@@ -3040,7 +2820,6 @@
             <w:r>
               <w:rPr>
                 <w:rFonts w:cs="Times New Roman" w:hint="eastAsia" w:ascii="Times New Roman" w:hAnsi="Times New Roman" w:eastAsia="標楷體"/>
-                <w:color w:val="000000"/>
                 <w:sz w:val="28"/>
                 <w:lang w:eastAsia="zh-TW"/>
               </w:rPr>
@@ -3061,8 +2840,7 @@
           </w:tcPr>
           <w:p>
             <w:pPr>
-              <w:keepNext w:val="0"/>
-              <w:spacing w:line="240" w:lineRule="auto" w:before="0" w:after="0"/>
+              <w:spacing w:before="0" w:after="0" w:line="240" w:lineRule="auto"/>
               <w:ind w:leftChars="0" w:left="0" w:rightChars="0" w:right="0" w:firstLine="0" w:firstLineChars="0"/>
               <w:rPr>
                 <w:b/>
@@ -3074,7 +2852,6 @@
             <w:r>
               <w:rPr>
                 <w:rFonts w:cs="Times New Roman" w:hint="eastAsia" w:ascii="Times New Roman" w:hAnsi="Times New Roman" w:eastAsia="標楷體"/>
-                <w:color w:val="000000"/>
                 <w:sz w:val="28"/>
                 <w:lang w:eastAsia="zh-TW"/>
               </w:rPr>
@@ -3083,7 +2860,6 @@
             <w:r>
               <w:rPr>
                 <w:rFonts w:cs="Times New Roman" w:hint="eastAsia" w:ascii="Times New Roman" w:hAnsi="Times New Roman" w:eastAsia="標楷體"/>
-                <w:color w:val="000000"/>
                 <w:sz w:val="28"/>
                 <w:lang w:eastAsia="zh-TW"/>
               </w:rPr>
@@ -3092,7 +2868,6 @@
             <w:r>
               <w:rPr>
                 <w:rFonts w:cs="Times New Roman" w:hint="eastAsia" w:ascii="Times New Roman" w:hAnsi="Times New Roman" w:eastAsia="標楷體"/>
-                <w:color w:val="000000"/>
                 <w:sz w:val="28"/>
                 <w:lang w:eastAsia="zh-TW"/>
               </w:rPr>
@@ -3101,7 +2876,6 @@
             <w:r>
               <w:rPr>
                 <w:rFonts w:cs="Times New Roman" w:hint="eastAsia" w:ascii="Times New Roman" w:hAnsi="Times New Roman" w:eastAsia="標楷體"/>
-                <w:color w:val="000000"/>
                 <w:sz w:val="28"/>
                 <w:lang w:eastAsia="zh-TW"/>
               </w:rPr>
@@ -3122,426 +2896,21 @@
           </w:tcPr>
           <w:p>
             <w:pPr>
-              <w:keepNext w:val="0"/>
-              <w:spacing w:line="240" w:lineRule="auto" w:before="0" w:after="0"/>
-              <w:ind w:leftChars="0" w:left="0" w:rightChars="0" w:right="0" w:firstLine="0" w:firstLineChars="0"/>
-              <w:snapToGrid w:val="0"/>
-            </w:pPr>
-            <w:r>
-              <w:rPr>
-                <w:rFonts w:cs="Times New Roman" w:ascii="Times New Roman" w:hAnsi="Times New Roman" w:eastAsia="標楷體"/>
-                <w:color w:val="000000"/>
-                <w:sz w:val="28"/>
-              </w:rPr>
-              <w:t>定位章節起頁：</w:t>
-            </w:r>
-            <w:r>
-              <w:rPr>
-                <w:rFonts w:cs="Times New Roman" w:ascii="Times New Roman" w:hAnsi="Times New Roman" w:eastAsia="標楷體"/>
-                <w:color w:val="000000"/>
-                <w:sz w:val="28"/>
-              </w:rPr>
-              <w:t>1</w:t>
-            </w:r>
-            <w:r>
-              <w:rPr>
-                <w:rFonts w:cs="Times New Roman" w:ascii="Times New Roman" w:hAnsi="Times New Roman" w:eastAsia="標楷體"/>
-                <w:color w:val="000000"/>
-                <w:sz w:val="28"/>
-              </w:rPr>
-              <w:t>章</w:t>
-            </w:r>
-            <w:r>
-              <w:rPr>
-                <w:rFonts w:cs="Times New Roman" w:ascii="Times New Roman" w:hAnsi="Times New Roman" w:eastAsia="標楷體"/>
-                <w:color w:val="000000"/>
-                <w:sz w:val="28"/>
-              </w:rPr>
-              <w:t xml:space="preserve"> p.</w:t>
-            </w:r>
-            <w:r>
-              <w:rPr>
-                <w:rFonts w:cs="Times New Roman" w:ascii="Times New Roman" w:hAnsi="Times New Roman" w:eastAsia="標楷體"/>
-                <w:noProof/>
-                <w:color w:val="000000"/>
-                <w:sz w:val="28"/>
-              </w:rPr>
-              <w:t>7</w:t>
-            </w:r>
-            <w:r>
-              <w:rPr>
-                <w:rFonts w:cs="Times New Roman" w:ascii="Times New Roman" w:hAnsi="Times New Roman" w:eastAsia="標楷體"/>
-                <w:color w:val="000000"/>
-                <w:sz w:val="28"/>
-              </w:rPr>
-              <w:t>；</w:t>
-            </w:r>
-            <w:r>
-              <w:rPr>
-                <w:rFonts w:cs="Times New Roman" w:ascii="Times New Roman" w:hAnsi="Times New Roman" w:eastAsia="標楷體"/>
-                <w:color w:val="000000"/>
-                <w:sz w:val="28"/>
-              </w:rPr>
-              <w:t>3</w:t>
-            </w:r>
-            <w:r>
-              <w:rPr>
-                <w:rFonts w:cs="Times New Roman" w:ascii="Times New Roman" w:hAnsi="Times New Roman" w:eastAsia="標楷體"/>
-                <w:color w:val="000000"/>
-                <w:sz w:val="28"/>
-              </w:rPr>
-              <w:t>章</w:t>
-            </w:r>
-            <w:r>
-              <w:rPr>
-                <w:rFonts w:cs="Times New Roman" w:ascii="Times New Roman" w:hAnsi="Times New Roman" w:eastAsia="標楷體"/>
-                <w:color w:val="000000"/>
-                <w:sz w:val="28"/>
-              </w:rPr>
-              <w:t xml:space="preserve"> p.</w:t>
-            </w:r>
-            <w:r>
-              <w:rPr>
-                <w:rFonts w:cs="Times New Roman" w:ascii="Times New Roman" w:hAnsi="Times New Roman" w:eastAsia="標楷體"/>
-                <w:noProof/>
-                <w:color w:val="000000"/>
-                <w:sz w:val="28"/>
-              </w:rPr>
-              <w:t>13</w:t>
-            </w:r>
-            <w:r>
-              <w:rPr>
-                <w:rFonts w:cs="Times New Roman" w:ascii="Times New Roman" w:hAnsi="Times New Roman" w:eastAsia="標楷體"/>
-                <w:color w:val="000000"/>
-                <w:sz w:val="28"/>
-              </w:rPr>
-              <w:t>；</w:t>
-            </w:r>
-            <w:r>
-              <w:rPr>
-                <w:rFonts w:cs="Times New Roman" w:ascii="Times New Roman" w:hAnsi="Times New Roman" w:eastAsia="標楷體"/>
-                <w:color w:val="000000"/>
-                <w:sz w:val="28"/>
-              </w:rPr>
-              <w:t>5</w:t>
-            </w:r>
-            <w:r>
-              <w:rPr>
-                <w:rFonts w:cs="Times New Roman" w:ascii="Times New Roman" w:hAnsi="Times New Roman" w:eastAsia="標楷體"/>
-                <w:color w:val="000000"/>
-                <w:sz w:val="28"/>
-              </w:rPr>
-              <w:t>章</w:t>
-            </w:r>
-            <w:r>
-              <w:rPr>
-                <w:rFonts w:cs="Times New Roman" w:ascii="Times New Roman" w:hAnsi="Times New Roman" w:eastAsia="標楷體"/>
-                <w:color w:val="000000"/>
-                <w:sz w:val="28"/>
-              </w:rPr>
-              <w:t xml:space="preserve"> p.</w:t>
-            </w:r>
-            <w:r>
-              <w:rPr>
-                <w:rFonts w:cs="Times New Roman" w:ascii="Times New Roman" w:hAnsi="Times New Roman" w:eastAsia="標楷體"/>
-                <w:noProof/>
-                <w:color w:val="000000"/>
-                <w:sz w:val="28"/>
-              </w:rPr>
-              <w:t>21</w:t>
-            </w:r>
-            <w:r>
-              <w:rPr>
-                <w:rFonts w:cs="Times New Roman" w:ascii="Times New Roman" w:hAnsi="Times New Roman" w:eastAsia="標楷體"/>
-                <w:color w:val="000000"/>
-                <w:sz w:val="28"/>
-              </w:rPr>
-              <w:t>；</w:t>
-            </w:r>
-            <w:r>
-              <w:rPr>
-                <w:rFonts w:cs="Times New Roman" w:ascii="Times New Roman" w:hAnsi="Times New Roman" w:eastAsia="標楷體"/>
-                <w:color w:val="000000"/>
-                <w:sz w:val="28"/>
-              </w:rPr>
-              <w:t>6</w:t>
-            </w:r>
-            <w:r>
-              <w:rPr>
-                <w:rFonts w:cs="Times New Roman" w:ascii="Times New Roman" w:hAnsi="Times New Roman" w:eastAsia="標楷體"/>
-                <w:color w:val="000000"/>
-                <w:sz w:val="28"/>
-              </w:rPr>
-              <w:t>章</w:t>
-            </w:r>
-            <w:r>
-              <w:rPr>
-                <w:rFonts w:cs="Times New Roman" w:ascii="Times New Roman" w:hAnsi="Times New Roman" w:eastAsia="標楷體"/>
-                <w:color w:val="000000"/>
-                <w:sz w:val="28"/>
-              </w:rPr>
-              <w:t xml:space="preserve"> p.</w:t>
-            </w:r>
-            <w:r>
-              <w:rPr>
-                <w:rFonts w:cs="Times New Roman" w:ascii="Times New Roman" w:hAnsi="Times New Roman" w:eastAsia="標楷體"/>
-                <w:noProof/>
-                <w:color w:val="000000"/>
-                <w:sz w:val="28"/>
-              </w:rPr>
-              <w:t>43</w:t>
-            </w:r>
-            <w:r>
-              <w:rPr>
-                <w:rFonts w:cs="Times New Roman" w:ascii="Times New Roman" w:hAnsi="Times New Roman" w:eastAsia="標楷體"/>
-                <w:color w:val="000000"/>
-                <w:sz w:val="28"/>
-              </w:rPr>
-              <w:t>；</w:t>
-            </w:r>
-            <w:r>
-              <w:rPr>
-                <w:rFonts w:cs="Times New Roman" w:ascii="Times New Roman" w:hAnsi="Times New Roman" w:eastAsia="標楷體"/>
-                <w:color w:val="000000"/>
-                <w:sz w:val="28"/>
-              </w:rPr>
-              <w:t>7</w:t>
-            </w:r>
-            <w:r>
-              <w:rPr>
-                <w:rFonts w:cs="Times New Roman" w:ascii="Times New Roman" w:hAnsi="Times New Roman" w:eastAsia="標楷體"/>
-                <w:color w:val="000000"/>
-                <w:sz w:val="28"/>
-              </w:rPr>
-              <w:t>章</w:t>
-            </w:r>
-            <w:r>
-              <w:rPr>
-                <w:rFonts w:cs="Times New Roman" w:ascii="Times New Roman" w:hAnsi="Times New Roman" w:eastAsia="標楷體"/>
-                <w:color w:val="000000"/>
-                <w:sz w:val="28"/>
-              </w:rPr>
-              <w:t xml:space="preserve"> p.</w:t>
-            </w:r>
-            <w:r>
-              <w:rPr>
-                <w:rFonts w:cs="Times New Roman" w:ascii="Times New Roman" w:hAnsi="Times New Roman" w:eastAsia="標楷體"/>
-                <w:noProof/>
-                <w:color w:val="000000"/>
-                <w:sz w:val="28"/>
-              </w:rPr>
-              <w:t>45</w:t>
-            </w:r>
-            <w:r>
-              <w:rPr>
-                <w:rFonts w:cs="Times New Roman" w:ascii="Times New Roman" w:hAnsi="Times New Roman" w:eastAsia="標楷體"/>
-                <w:color w:val="000000"/>
-                <w:sz w:val="28"/>
-              </w:rPr>
-              <w:t>；</w:t>
-            </w:r>
-            <w:r>
-              <w:rPr>
-                <w:rFonts w:cs="Times New Roman" w:ascii="Times New Roman" w:hAnsi="Times New Roman" w:eastAsia="標楷體"/>
-                <w:color w:val="000000"/>
-                <w:sz w:val="28"/>
-              </w:rPr>
-              <w:t>8</w:t>
-            </w:r>
-            <w:r>
-              <w:rPr>
-                <w:rFonts w:cs="Times New Roman" w:ascii="Times New Roman" w:hAnsi="Times New Roman" w:eastAsia="標楷體"/>
-                <w:color w:val="000000"/>
-                <w:sz w:val="28"/>
-              </w:rPr>
-              <w:t>章</w:t>
-            </w:r>
-            <w:r>
-              <w:rPr>
-                <w:rFonts w:cs="Times New Roman" w:ascii="Times New Roman" w:hAnsi="Times New Roman" w:eastAsia="標楷體"/>
-                <w:color w:val="000000"/>
-                <w:sz w:val="28"/>
-              </w:rPr>
-              <w:t xml:space="preserve"> p.</w:t>
-            </w:r>
-            <w:r>
-              <w:rPr>
-                <w:rFonts w:cs="Times New Roman" w:ascii="Times New Roman" w:hAnsi="Times New Roman" w:eastAsia="標楷體"/>
-                <w:noProof/>
-                <w:color w:val="000000"/>
-                <w:sz w:val="28"/>
-              </w:rPr>
-              <w:t>53</w:t>
-            </w:r>
-            <w:r>
-              <w:rPr>
-                <w:rFonts w:cs="Times New Roman" w:ascii="Times New Roman" w:hAnsi="Times New Roman" w:eastAsia="標楷體"/>
-                <w:color w:val="000000"/>
-                <w:sz w:val="28"/>
-              </w:rPr>
-              <w:t>；</w:t>
-            </w:r>
-            <w:r>
-              <w:rPr>
-                <w:rFonts w:cs="Times New Roman" w:ascii="Times New Roman" w:hAnsi="Times New Roman" w:eastAsia="標楷體"/>
-                <w:color w:val="000000"/>
-                <w:sz w:val="28"/>
-              </w:rPr>
-              <w:t>10</w:t>
-            </w:r>
-            <w:r>
-              <w:rPr>
-                <w:rFonts w:cs="Times New Roman" w:ascii="Times New Roman" w:hAnsi="Times New Roman" w:eastAsia="標楷體"/>
-                <w:color w:val="000000"/>
-                <w:sz w:val="28"/>
-              </w:rPr>
-              <w:t>章</w:t>
-            </w:r>
-            <w:r>
-              <w:rPr>
-                <w:rFonts w:cs="Times New Roman" w:ascii="Times New Roman" w:hAnsi="Times New Roman" w:eastAsia="標楷體"/>
-                <w:color w:val="000000"/>
-                <w:sz w:val="28"/>
-              </w:rPr>
-              <w:t xml:space="preserve"> p.</w:t>
-            </w:r>
-            <w:r>
-              <w:rPr>
-                <w:rFonts w:cs="Times New Roman" w:ascii="Times New Roman" w:hAnsi="Times New Roman" w:eastAsia="標楷體"/>
-                <w:noProof/>
-                <w:color w:val="000000"/>
-                <w:sz w:val="28"/>
-              </w:rPr>
-              <w:t>66</w:t>
-            </w:r>
-            <w:r>
-              <w:rPr>
-                <w:rFonts w:cs="Times New Roman" w:ascii="Times New Roman" w:hAnsi="Times New Roman" w:eastAsia="標楷體"/>
-                <w:color w:val="000000"/>
-                <w:sz w:val="28"/>
-              </w:rPr>
-              <w:t>；</w:t>
-            </w:r>
-            <w:r>
-              <w:rPr>
-                <w:rFonts w:cs="Times New Roman" w:ascii="Times New Roman" w:hAnsi="Times New Roman" w:eastAsia="標楷體"/>
-                <w:color w:val="000000"/>
-                <w:sz w:val="28"/>
-              </w:rPr>
-              <w:t>11</w:t>
-            </w:r>
-            <w:r>
-              <w:rPr>
-                <w:rFonts w:cs="Times New Roman" w:ascii="Times New Roman" w:hAnsi="Times New Roman" w:eastAsia="標楷體"/>
-                <w:color w:val="000000"/>
-                <w:sz w:val="28"/>
-              </w:rPr>
-              <w:t>章</w:t>
-            </w:r>
-            <w:r>
-              <w:rPr>
-                <w:rFonts w:cs="Times New Roman" w:ascii="Times New Roman" w:hAnsi="Times New Roman" w:eastAsia="標楷體"/>
-                <w:color w:val="000000"/>
-                <w:sz w:val="28"/>
-              </w:rPr>
-              <w:t xml:space="preserve"> p.</w:t>
-            </w:r>
-            <w:r>
-              <w:rPr>
-                <w:rFonts w:cs="Times New Roman" w:ascii="Times New Roman" w:hAnsi="Times New Roman" w:eastAsia="標楷體"/>
-                <w:noProof/>
-                <w:color w:val="000000"/>
-                <w:sz w:val="28"/>
-              </w:rPr>
-              <w:t>69</w:t>
-            </w:r>
-            <w:r>
-              <w:rPr>
-                <w:rFonts w:cs="Times New Roman" w:ascii="Times New Roman" w:hAnsi="Times New Roman" w:eastAsia="標楷體"/>
-                <w:color w:val="000000"/>
-                <w:sz w:val="28"/>
-              </w:rPr>
-              <w:t>；</w:t>
-            </w:r>
-            <w:r>
-              <w:rPr>
-                <w:rFonts w:cs="Times New Roman" w:ascii="Times New Roman" w:hAnsi="Times New Roman" w:eastAsia="標楷體"/>
-                <w:color w:val="000000"/>
-                <w:sz w:val="28"/>
-              </w:rPr>
-              <w:t>12</w:t>
-            </w:r>
-            <w:r>
-              <w:rPr>
-                <w:rFonts w:cs="Times New Roman" w:ascii="Times New Roman" w:hAnsi="Times New Roman" w:eastAsia="標楷體"/>
-                <w:color w:val="000000"/>
-                <w:sz w:val="28"/>
-              </w:rPr>
-              <w:t>章</w:t>
-            </w:r>
-            <w:r>
-              <w:rPr>
-                <w:rFonts w:cs="Times New Roman" w:ascii="Times New Roman" w:hAnsi="Times New Roman" w:eastAsia="標楷體"/>
-                <w:color w:val="000000"/>
-                <w:sz w:val="28"/>
-              </w:rPr>
-              <w:t xml:space="preserve"> p.</w:t>
-            </w:r>
-            <w:r>
-              <w:rPr>
-                <w:rFonts w:cs="Times New Roman" w:ascii="Times New Roman" w:hAnsi="Times New Roman" w:eastAsia="標楷體"/>
-                <w:noProof/>
-                <w:color w:val="000000"/>
-                <w:sz w:val="28"/>
-              </w:rPr>
-              <w:t>72</w:t>
-            </w:r>
-            <w:r>
-              <w:rPr>
-                <w:rFonts w:cs="Times New Roman" w:ascii="Times New Roman" w:hAnsi="Times New Roman" w:eastAsia="標楷體"/>
-                <w:color w:val="000000"/>
-                <w:sz w:val="28"/>
-              </w:rPr>
-              <w:t>；</w:t>
-            </w:r>
-            <w:r>
-              <w:rPr>
-                <w:rFonts w:cs="Times New Roman" w:ascii="Times New Roman" w:hAnsi="Times New Roman" w:eastAsia="標楷體"/>
-                <w:color w:val="000000"/>
-                <w:sz w:val="28"/>
-              </w:rPr>
-              <w:t>14</w:t>
-            </w:r>
-            <w:r>
-              <w:rPr>
-                <w:rFonts w:cs="Times New Roman" w:ascii="Times New Roman" w:hAnsi="Times New Roman" w:eastAsia="標楷體"/>
-                <w:color w:val="000000"/>
-                <w:sz w:val="28"/>
-              </w:rPr>
-              <w:t>章</w:t>
-            </w:r>
-            <w:r>
-              <w:rPr>
-                <w:rFonts w:cs="Times New Roman" w:ascii="Times New Roman" w:hAnsi="Times New Roman" w:eastAsia="標楷體"/>
-                <w:color w:val="000000"/>
-                <w:sz w:val="28"/>
-              </w:rPr>
-              <w:t xml:space="preserve"> p.</w:t>
-            </w:r>
-            <w:r>
-              <w:rPr>
-                <w:rFonts w:cs="Times New Roman" w:ascii="Times New Roman" w:hAnsi="Times New Roman" w:eastAsia="標楷體"/>
-                <w:noProof/>
-                <w:color w:val="000000"/>
-                <w:sz w:val="28"/>
-              </w:rPr>
-              <w:t>77</w:t>
+              <w:spacing w:before="0" w:after="0" w:line="240" w:lineRule="auto"/>
+              <w:ind w:left="0" w:right="0" w:firstLine="0" w:leftChars="0" w:rightChars="0" w:firstLineChars="0"/>
+              <w:snapToGrid w:val="0"/>
+            </w:pPr>
+            <w:r>
+              <w:rPr>
+                <w:rFonts w:ascii="Times New Roman" w:hAnsi="Times New Roman" w:eastAsia="標楷體"/>
+                <w:sz w:val="28"/>
+              </w:rPr>
+              <w:t>1章 p.7；3章 p.13；5章 p.22；6章 p.45；7章 p.47；8章 p.55；10章 p.68；11章 p.72；12章 p.75；14章 p.81</w:t>
             </w:r>
           </w:p>
         </w:tc>
       </w:tr>
       <w:tr>
-        <w:trPr/>
         <w:tc>
           <w:tcPr>
             <w:tcW w:w="907" w:type="dxa"/>
@@ -3555,15 +2924,13 @@
           </w:tcPr>
           <w:p>
             <w:pPr>
-              <w:keepNext w:val="0"/>
-              <w:spacing w:line="240" w:lineRule="auto" w:before="0" w:after="0"/>
-              <w:ind w:leftChars="0" w:left="0" w:rightChars="0" w:right="0" w:firstLine="0" w:firstLineChars="0"/>
-              <w:snapToGrid w:val="0"/>
-            </w:pPr>
-            <w:r>
-              <w:rPr>
-                <w:rFonts w:cs="Times New Roman" w:ascii="Times New Roman" w:hAnsi="Times New Roman" w:eastAsia="標楷體"/>
-                <w:color w:val="000000"/>
+              <w:spacing w:before="0" w:after="0" w:line="240" w:lineRule="auto"/>
+              <w:ind w:leftChars="0" w:left="0" w:rightChars="0" w:right="0" w:firstLine="0" w:firstLineChars="0"/>
+              <w:snapToGrid w:val="0"/>
+            </w:pPr>
+            <w:r>
+              <w:rPr>
+                <w:rFonts w:cs="Times New Roman" w:ascii="Times New Roman" w:hAnsi="Times New Roman" w:eastAsia="標楷體"/>
                 <w:sz w:val="28"/>
               </w:rPr>
               <w:t>AI-3</w:t>
@@ -3583,15 +2950,13 @@
           </w:tcPr>
           <w:p>
             <w:pPr>
-              <w:keepNext w:val="0"/>
-              <w:spacing w:line="240" w:lineRule="auto" w:before="0" w:after="0"/>
-              <w:ind w:leftChars="0" w:left="0" w:rightChars="0" w:right="0" w:firstLine="0" w:firstLineChars="0"/>
-              <w:snapToGrid w:val="0"/>
-            </w:pPr>
-            <w:r>
-              <w:rPr>
-                <w:rFonts w:cs="Times New Roman" w:ascii="Times New Roman" w:hAnsi="Times New Roman" w:eastAsia="標楷體"/>
-                <w:color w:val="000000"/>
+              <w:spacing w:before="0" w:after="0" w:line="240" w:lineRule="auto"/>
+              <w:ind w:leftChars="0" w:left="0" w:rightChars="0" w:right="0" w:firstLine="0" w:firstLineChars="0"/>
+              <w:snapToGrid w:val="0"/>
+            </w:pPr>
+            <w:r>
+              <w:rPr>
+                <w:rFonts w:cs="Times New Roman" w:ascii="Times New Roman" w:hAnsi="Times New Roman" w:eastAsia="標楷體"/>
                 <w:sz w:val="28"/>
               </w:rPr>
               <w:t>OpenAI Codex</w:t>
@@ -3599,7 +2964,6 @@
             <w:r>
               <w:rPr>
                 <w:rFonts w:cs="Times New Roman" w:ascii="Times New Roman" w:hAnsi="Times New Roman" w:eastAsia="標楷體"/>
-                <w:color w:val="000000"/>
                 <w:sz w:val="28"/>
               </w:rPr>
               <w:t>（規範修訂）</w:t>
@@ -3619,42 +2983,51 @@
           </w:tcPr>
           <w:p>
             <w:pPr>
-              <w:keepNext w:val="0"/>
-              <w:spacing w:line="240" w:lineRule="auto" w:before="0" w:after="0"/>
-              <w:ind w:leftChars="0" w:left="0" w:rightChars="0" w:right="0" w:firstLine="0" w:firstLineChars="0"/>
-              <w:snapToGrid w:val="0"/>
-            </w:pPr>
-            <w:r>
-              <w:rPr>
-                <w:rFonts w:cs="Times New Roman" w:ascii="Times New Roman" w:hAnsi="Times New Roman" w:eastAsia="標楷體"/>
-                <w:color w:val="000000"/>
+              <w:spacing w:before="0" w:after="0" w:line="240" w:lineRule="auto"/>
+              <w:ind w:leftChars="0" w:left="0" w:rightChars="0" w:right="0" w:firstLine="0" w:firstLineChars="0"/>
+              <w:snapToGrid w:val="0"/>
+            </w:pPr>
+            <w:r>
+              <w:rPr>
+                <w:rFonts w:ascii="Times New Roman" w:hAnsi="Times New Roman" w:eastAsia="標楷體"/>
                 <w:sz w:val="28"/>
               </w:rPr>
               <w:t xml:space="preserve">2026-10-04 </w:t>
             </w:r>
             <w:r>
               <w:rPr>
-                <w:rFonts w:cs="Times New Roman" w:ascii="Times New Roman" w:hAnsi="Times New Roman" w:eastAsia="標楷體"/>
-                <w:color w:val="000000"/>
-                <w:sz w:val="28"/>
-              </w:rPr>
-              <w:t>依系上公告調整封面、章節與版面，補狀態機、程式規格、後續時程、</w:t>
-            </w:r>
-            <w:r>
-              <w:rPr>
-                <w:rFonts w:cs="Times New Roman" w:ascii="Times New Roman" w:hAnsi="Times New Roman" w:eastAsia="標楷體"/>
-                <w:color w:val="000000"/>
+                <w:rFonts w:ascii="Times New Roman" w:hAnsi="Times New Roman" w:eastAsia="標楷體"/>
+                <w:sz w:val="28"/>
+              </w:rPr>
+              <w:t>第一輪依公告調整格式，補狀態機、程式規格、時程、</w:t>
+            </w:r>
+            <w:r>
+              <w:rPr>
+                <w:rFonts w:ascii="Times New Roman" w:hAnsi="Times New Roman" w:eastAsia="標楷體"/>
                 <w:sz w:val="28"/>
               </w:rPr>
               <w:t xml:space="preserve">Git </w:t>
             </w:r>
             <w:r>
               <w:rPr>
-                <w:rFonts w:cs="Times New Roman" w:ascii="Times New Roman" w:hAnsi="Times New Roman" w:eastAsia="標楷體"/>
-                <w:color w:val="000000"/>
-                <w:sz w:val="28"/>
-              </w:rPr>
-              <w:t>佐證說明及評審修正表架構。未代填評語原文、實際分工、個人心得或歷史週報。</w:t>
+                <w:rFonts w:ascii="Times New Roman" w:hAnsi="Times New Roman" w:eastAsia="標楷體"/>
+                <w:sz w:val="28"/>
+              </w:rPr>
+              <w:t>佐證說明及評審修正表架構。該輪未取得評語內容；本輪逐字稿整理另列</w:t>
+            </w:r>
+            <w:r>
+              <w:rPr>
+                <w:rFonts w:ascii="Times New Roman" w:hAnsi="Times New Roman" w:eastAsia="標楷體"/>
+                <w:sz w:val="28"/>
+              </w:rPr>
+              <w:t xml:space="preserve"> AI-4</w:t>
+            </w:r>
+            <w:r>
+              <w:rPr>
+                <w:rFonts w:ascii="Times New Roman" w:hAnsi="Times New Roman" w:eastAsia="標楷體"/>
+                <w:sz w:val="28"/>
+              </w:rPr>
+              <w:t>，未代填實際分工、心得或歷史週報。</w:t>
             </w:r>
           </w:p>
         </w:tc>
@@ -3671,18 +3044,108 @@
           </w:tcPr>
           <w:p>
             <w:pPr>
-              <w:keepNext w:val="0"/>
-              <w:spacing w:line="240" w:lineRule="auto" w:before="0" w:after="0"/>
-              <w:ind w:firstLine="0" w:left="0" w:right="0" w:leftChars="0" w:rightChars="0" w:firstLineChars="0"/>
-              <w:snapToGrid w:val="0"/>
-            </w:pPr>
-            <w:r>
-              <w:rPr>
-                <w:rFonts w:ascii="Times New Roman" w:hAnsi="Times New Roman" w:eastAsia="標楷體" w:cs="Times New Roman"/>
-                <w:color w:val="000000"/>
-                <w:sz w:val="28"/>
-              </w:rPr>
-              <w:t>全冊格式；內容：4章 p.15；7-4 p.46；9-3 p.63；附錄A p.80</w:t>
+              <w:spacing w:before="0" w:after="0" w:line="240" w:lineRule="auto"/>
+              <w:ind w:left="0" w:right="0" w:firstLine="0" w:leftChars="0" w:rightChars="0" w:firstLineChars="0"/>
+              <w:snapToGrid w:val="0"/>
+            </w:pPr>
+            <w:r>
+              <w:rPr>
+                <w:rFonts w:ascii="Times New Roman" w:hAnsi="Times New Roman" w:eastAsia="標楷體"/>
+                <w:sz w:val="28"/>
+              </w:rPr>
+              <w:t>全冊格式；內容：4章 p.16；7-4 p.48；9-3 p.65；附錄A p.84</w:t>
+            </w:r>
+          </w:p>
+        </w:tc>
+      </w:tr>
+      <w:tr>
+        <w:tc>
+          <w:tcPr>
+            <w:tcW w:w="907" w:type="dxa"/>
+          </w:tcPr>
+          <w:p>
+            <w:pPr>
+              <w:spacing w:before="0" w:after="0" w:line="240" w:lineRule="auto"/>
+              <w:ind w:leftChars="0" w:left="0" w:rightChars="0" w:right="0" w:firstLine="0" w:firstLineChars="0"/>
+              <w:snapToGrid w:val="0"/>
+            </w:pPr>
+            <w:r>
+              <w:rPr>
+                <w:rFonts w:ascii="Times New Roman" w:hAnsi="Times New Roman" w:eastAsia="標楷體"/>
+                <w:sz w:val="28"/>
+              </w:rPr>
+              <w:t>AI-4</w:t>
+            </w:r>
+          </w:p>
+        </w:tc>
+        <w:tc>
+          <w:tcPr>
+            <w:tcW w:w="1984" w:type="dxa"/>
+          </w:tcPr>
+          <w:p>
+            <w:pPr>
+              <w:spacing w:before="0" w:after="0" w:line="240" w:lineRule="auto"/>
+              <w:ind w:leftChars="0" w:left="0" w:rightChars="0" w:right="0" w:firstLine="0" w:firstLineChars="0"/>
+              <w:snapToGrid w:val="0"/>
+            </w:pPr>
+            <w:r>
+              <w:rPr>
+                <w:rFonts w:ascii="Times New Roman" w:hAnsi="Times New Roman" w:eastAsia="標楷體"/>
+                <w:sz w:val="28"/>
+              </w:rPr>
+              <w:t>OpenAI Codex</w:t>
+            </w:r>
+            <w:r>
+              <w:rPr>
+                <w:rFonts w:ascii="Times New Roman" w:hAnsi="Times New Roman" w:eastAsia="標楷體"/>
+                <w:sz w:val="28"/>
+              </w:rPr>
+              <w:t>（逐字稿整理）</w:t>
+            </w:r>
+          </w:p>
+        </w:tc>
+        <w:tc>
+          <w:tcPr>
+            <w:tcW w:w="4082" w:type="dxa"/>
+          </w:tcPr>
+          <w:p>
+            <w:pPr>
+              <w:spacing w:before="0" w:after="0" w:line="240" w:lineRule="auto"/>
+              <w:ind w:leftChars="0" w:left="0" w:rightChars="0" w:right="0" w:firstLine="0" w:firstLineChars="0"/>
+              <w:snapToGrid w:val="0"/>
+            </w:pPr>
+            <w:r>
+              <w:rPr>
+                <w:rFonts w:ascii="Times New Roman" w:hAnsi="Times New Roman" w:eastAsia="標楷體"/>
+                <w:sz w:val="28"/>
+              </w:rPr>
+              <w:t xml:space="preserve">2026-10-04 </w:t>
+            </w:r>
+            <w:r>
+              <w:rPr>
+                <w:rFonts w:ascii="Times New Roman" w:hAnsi="Times New Roman" w:eastAsia="標楷體"/>
+                <w:sz w:val="28"/>
+              </w:rPr>
+              <w:t>依使用者提供的語音轉文字，整理可辨識的提問／建議，修訂動機、需求與比較／驗證／展示規劃。節錄保留原詞，歸納與不明片段另註；沒有原始音檔，不宣稱還原正式評語或完成實測。</w:t>
+            </w:r>
+          </w:p>
+        </w:tc>
+        <w:tc>
+          <w:tcPr>
+            <w:tcW w:w="3118" w:type="dxa"/>
+          </w:tcPr>
+          <w:p>
+            <w:pPr>
+              <w:spacing w:before="0" w:after="0" w:line="240" w:lineRule="auto"/>
+              <w:ind w:left="0" w:right="0" w:firstLine="0" w:leftChars="0" w:rightChars="0" w:firstLineChars="0"/>
+              <w:snapToGrid w:val="0"/>
+            </w:pPr>
+            <w:r>
+              <w:rPr>
+                <w:rFonts w:ascii="Times New Roman" w:hAnsi="Times New Roman" w:eastAsia="標楷體"/>
+                <w:sz w:val="28"/>
+              </w:rPr>
+              <w:t>1-2 p.7；3-4 p.15；4-2 p.17；5-1 p.22；第6章 p.45；10-3 p.71；12-3 p.78；附錄A p.84</w:t>
             </w:r>
           </w:p>
         </w:tc>

</xml_diff>

<commit_message>
docs: sync code image disclosure and final manual page references
</commit_message>
<xml_diff>
--- a/documents/參考資料.docx
+++ b/documents/參考資料.docx
@@ -2493,18 +2493,15 @@
           </w:tcPr>
           <w:p>
             <w:pPr>
-              <w:spacing w:before="0" w:after="0" w:line="240" w:lineRule="auto"/>
-              <w:ind w:leftChars="0" w:left="0" w:rightChars="0" w:right="0" w:firstLine="0" w:firstLineChars="0"/>
+              <w:ind w:leftChars="0" w:left="0" w:rightChars="0" w:right="0"/>
               <w:jc w:val="center"/>
               <w:rPr>
                 <w:lang w:eastAsia="zh-TW"/>
               </w:rPr>
-              <w:snapToGrid w:val="0"/>
-            </w:pPr>
-            <w:r>
-              <w:rPr>
-                <w:rFonts w:cs="Times New Roman" w:hint="eastAsia" w:ascii="Times New Roman" w:hAnsi="Times New Roman" w:eastAsia="標楷體"/>
-                <w:sz w:val="28"/>
+            </w:pPr>
+            <w:r>
+              <w:rPr>
+                <w:rFonts w:cs="Times New Roman" w:hint="eastAsia"/>
                 <w:lang w:eastAsia="zh-TW"/>
               </w:rPr>
               <w:t>序號</w:t>
@@ -2524,18 +2521,15 @@
           </w:tcPr>
           <w:p>
             <w:pPr>
-              <w:spacing w:before="0" w:after="0" w:line="240" w:lineRule="auto"/>
-              <w:ind w:leftChars="0" w:left="0" w:rightChars="0" w:right="0" w:firstLine="0" w:firstLineChars="0"/>
+              <w:ind w:leftChars="0" w:left="0" w:rightChars="0" w:right="0"/>
               <w:jc w:val="center"/>
               <w:rPr>
                 <w:lang w:eastAsia="zh-TW"/>
               </w:rPr>
-              <w:snapToGrid w:val="0"/>
-            </w:pPr>
-            <w:r>
-              <w:rPr>
-                <w:rFonts w:cs="Times New Roman" w:hint="eastAsia" w:ascii="Times New Roman" w:hAnsi="Times New Roman" w:eastAsia="標楷體"/>
-                <w:sz w:val="28"/>
+            </w:pPr>
+            <w:r>
+              <w:rPr>
+                <w:rFonts w:cs="Times New Roman" w:hint="eastAsia"/>
                 <w:lang w:eastAsia="zh-TW"/>
               </w:rPr>
               <w:t>使用工具名稱</w:t>
@@ -2555,18 +2549,15 @@
           </w:tcPr>
           <w:p>
             <w:pPr>
-              <w:spacing w:before="0" w:after="0" w:line="240" w:lineRule="auto"/>
-              <w:ind w:leftChars="0" w:left="0" w:rightChars="0" w:right="0" w:firstLine="0" w:firstLineChars="0"/>
+              <w:ind w:leftChars="0" w:left="0" w:rightChars="0" w:right="0"/>
               <w:jc w:val="center"/>
               <w:rPr>
                 <w:lang w:eastAsia="zh-TW"/>
               </w:rPr>
-              <w:snapToGrid w:val="0"/>
-            </w:pPr>
-            <w:r>
-              <w:rPr>
-                <w:rFonts w:cs="Times New Roman" w:hint="eastAsia" w:ascii="Times New Roman" w:hAnsi="Times New Roman" w:eastAsia="標楷體"/>
-                <w:sz w:val="28"/>
+            </w:pPr>
+            <w:r>
+              <w:rPr>
+                <w:rFonts w:cs="Times New Roman" w:hint="eastAsia"/>
                 <w:lang w:eastAsia="zh-TW"/>
               </w:rPr>
               <w:t>使用範圍及說明</w:t>
@@ -2586,14 +2577,11 @@
           </w:tcPr>
           <w:p>
             <w:pPr>
-              <w:spacing w:before="0" w:after="0" w:line="240" w:lineRule="auto"/>
-              <w:ind w:leftChars="0" w:left="0" w:rightChars="0" w:right="0" w:firstLine="0" w:firstLineChars="0"/>
-              <w:snapToGrid w:val="0"/>
-            </w:pPr>
-            <w:r>
-              <w:rPr>
-                <w:rFonts w:cs="Times New Roman" w:ascii="Times New Roman" w:hAnsi="Times New Roman" w:eastAsia="標楷體"/>
-                <w:sz w:val="28"/>
+              <w:ind w:leftChars="0" w:left="0" w:rightChars="0" w:right="0"/>
+            </w:pPr>
+            <w:r>
+              <w:rPr>
+                <w:rFonts w:cs="Times New Roman"/>
               </w:rPr>
               <w:t>頁碼及定位</w:t>
             </w:r>
@@ -2617,14 +2605,11 @@
           </w:tcPr>
           <w:p>
             <w:pPr>
-              <w:spacing w:before="0" w:after="0" w:line="240" w:lineRule="auto"/>
-              <w:ind w:leftChars="0" w:left="0" w:rightChars="0" w:right="0" w:firstLine="0" w:firstLineChars="0"/>
-              <w:snapToGrid w:val="0"/>
-            </w:pPr>
-            <w:r>
-              <w:rPr>
-                <w:rFonts w:cs="Times New Roman" w:ascii="Times New Roman" w:hAnsi="Times New Roman" w:eastAsia="標楷體"/>
-                <w:sz w:val="28"/>
+              <w:ind w:leftChars="0" w:left="0" w:rightChars="0" w:right="0"/>
+            </w:pPr>
+            <w:r>
+              <w:rPr>
+                <w:rFonts w:cs="Times New Roman"/>
               </w:rPr>
               <w:t>AI-1</w:t>
             </w:r>
@@ -2643,26 +2628,22 @@
           </w:tcPr>
           <w:p>
             <w:pPr>
-              <w:spacing w:before="0" w:after="0" w:line="240" w:lineRule="auto"/>
-              <w:ind w:leftChars="0" w:left="0" w:rightChars="0" w:right="0" w:firstLine="0" w:firstLineChars="0"/>
+              <w:ind w:leftChars="0" w:left="0" w:rightChars="0" w:right="0"/>
               <w:jc w:val="center"/>
               <w:rPr>
                 <w:lang w:eastAsia="zh-TW"/>
               </w:rPr>
-              <w:snapToGrid w:val="0"/>
-            </w:pPr>
-            <w:r>
-              <w:rPr>
-                <w:rFonts w:cs="Times New Roman" w:hint="eastAsia" w:ascii="Times New Roman" w:hAnsi="Times New Roman" w:eastAsia="標楷體"/>
-                <w:sz w:val="28"/>
+            </w:pPr>
+            <w:r>
+              <w:rPr>
+                <w:rFonts w:cs="Times New Roman" w:hint="eastAsia"/>
                 <w:lang w:eastAsia="zh-TW"/>
               </w:rPr>
               <w:t>Google Gemini</w:t>
             </w:r>
             <w:r>
               <w:rPr>
-                <w:rFonts w:cs="Times New Roman" w:hint="eastAsia" w:ascii="Times New Roman" w:hAnsi="Times New Roman" w:eastAsia="標楷體"/>
-                <w:sz w:val="28"/>
+                <w:rFonts w:cs="Times New Roman" w:hint="eastAsia"/>
                 <w:lang w:eastAsia="zh-TW"/>
               </w:rPr>
               <w:t>（系統服務）</w:t>
@@ -2682,49 +2663,42 @@
           </w:tcPr>
           <w:p>
             <w:pPr>
-              <w:spacing w:before="0" w:after="0" w:line="240" w:lineRule="auto"/>
-              <w:ind w:leftChars="0" w:left="0" w:rightChars="0" w:right="0" w:firstLine="0" w:firstLineChars="0"/>
-              <w:rPr>
-                <w:lang w:eastAsia="zh-TW"/>
-              </w:rPr>
-              <w:snapToGrid w:val="0"/>
-            </w:pPr>
-            <w:r>
-              <w:rPr>
-                <w:rFonts w:cs="Times New Roman" w:hint="eastAsia" w:ascii="Times New Roman" w:hAnsi="Times New Roman" w:eastAsia="標楷體"/>
-                <w:sz w:val="28"/>
+              <w:ind w:leftChars="0" w:left="0" w:rightChars="0" w:right="0"/>
+              <w:rPr>
+                <w:lang w:eastAsia="zh-TW"/>
+              </w:rPr>
+            </w:pPr>
+            <w:r>
+              <w:rPr>
+                <w:rFonts w:cs="Times New Roman" w:hint="eastAsia"/>
                 <w:lang w:eastAsia="zh-TW"/>
               </w:rPr>
               <w:t>用於植物影像候選判讀，以及</w:t>
             </w:r>
             <w:r>
               <w:rPr>
-                <w:rFonts w:cs="Times New Roman" w:hint="eastAsia" w:ascii="Times New Roman" w:hAnsi="Times New Roman" w:eastAsia="標楷體"/>
-                <w:sz w:val="28"/>
+                <w:rFonts w:cs="Times New Roman" w:hint="eastAsia"/>
                 <w:lang w:eastAsia="zh-TW"/>
               </w:rPr>
               <w:t xml:space="preserve"> RAG </w:t>
             </w:r>
             <w:r>
               <w:rPr>
-                <w:rFonts w:cs="Times New Roman" w:hint="eastAsia" w:ascii="Times New Roman" w:hAnsi="Times New Roman" w:eastAsia="標楷體"/>
-                <w:sz w:val="28"/>
+                <w:rFonts w:cs="Times New Roman" w:hint="eastAsia"/>
                 <w:lang w:eastAsia="zh-TW"/>
               </w:rPr>
               <w:t>建庫與檢索的文字向量（</w:t>
             </w:r>
             <w:r>
               <w:rPr>
-                <w:rFonts w:cs="Times New Roman" w:hint="eastAsia" w:ascii="Times New Roman" w:hAnsi="Times New Roman" w:eastAsia="標楷體"/>
-                <w:sz w:val="28"/>
+                <w:rFonts w:cs="Times New Roman" w:hint="eastAsia"/>
                 <w:lang w:eastAsia="zh-TW"/>
               </w:rPr>
               <w:t>embedding</w:t>
             </w:r>
             <w:r>
               <w:rPr>
-                <w:rFonts w:cs="Times New Roman" w:hint="eastAsia" w:ascii="Times New Roman" w:hAnsi="Times New Roman" w:eastAsia="標楷體"/>
-                <w:sz w:val="28"/>
+                <w:rFonts w:cs="Times New Roman" w:hint="eastAsia"/>
                 <w:lang w:eastAsia="zh-TW"/>
               </w:rPr>
               <w:t>）。病蟲害建議另經資料庫校驗；模型輸出、信心值與來源欄位均不代表專業核准或專家簽核。此列揭露系統服務用途，不推定歷史文件撰寫者。</w:t>
@@ -2744,16 +2718,10 @@
           </w:tcPr>
           <w:p>
             <w:pPr>
-              <w:spacing w:before="0" w:after="0" w:line="240" w:lineRule="auto"/>
-              <w:ind w:left="0" w:right="0" w:firstLine="0" w:leftChars="0" w:rightChars="0" w:firstLineChars="0"/>
-              <w:snapToGrid w:val="0"/>
-            </w:pPr>
-            <w:r>
-              <w:rPr>
-                <w:rFonts w:ascii="Times New Roman" w:hAnsi="Times New Roman" w:eastAsia="標楷體"/>
-                <w:sz w:val="28"/>
-              </w:rPr>
-              <w:t>1章 p.7；3章 p.13；5章 p.22；6章 p.45；7章 p.47；8章 p.55；11章 p.72；12章 p.75</w:t>
+              <w:ind w:leftChars="0" w:left="0" w:rightChars="0" w:right="0"/>
+            </w:pPr>
+            <w:r>
+              <w:t>1章 p.7；3章 p.13；5章 p.22；6章 p.45；7章 p.47；8章 p.55；11章 p.79；12章 p.82</w:t>
             </w:r>
           </w:p>
         </w:tc>
@@ -2775,14 +2743,11 @@
           </w:tcPr>
           <w:p>
             <w:pPr>
-              <w:spacing w:before="0" w:after="0" w:line="240" w:lineRule="auto"/>
-              <w:ind w:leftChars="0" w:left="0" w:rightChars="0" w:right="0" w:firstLine="0" w:firstLineChars="0"/>
-              <w:snapToGrid w:val="0"/>
-            </w:pPr>
-            <w:r>
-              <w:rPr>
-                <w:rFonts w:cs="Times New Roman" w:ascii="Times New Roman" w:hAnsi="Times New Roman" w:eastAsia="標楷體"/>
-                <w:sz w:val="28"/>
+              <w:ind w:leftChars="0" w:left="0" w:rightChars="0" w:right="0"/>
+            </w:pPr>
+            <w:r>
+              <w:rPr>
+                <w:rFonts w:cs="Times New Roman"/>
               </w:rPr>
               <w:t>AI-2</w:t>
             </w:r>
@@ -2801,26 +2766,22 @@
           </w:tcPr>
           <w:p>
             <w:pPr>
-              <w:spacing w:before="0" w:after="0" w:line="240" w:lineRule="auto"/>
-              <w:ind w:leftChars="0" w:left="0" w:rightChars="0" w:right="0" w:firstLine="0" w:firstLineChars="0"/>
+              <w:ind w:leftChars="0" w:left="0" w:rightChars="0" w:right="0"/>
               <w:jc w:val="center"/>
               <w:rPr>
                 <w:lang w:eastAsia="zh-TW"/>
               </w:rPr>
-              <w:snapToGrid w:val="0"/>
-            </w:pPr>
-            <w:r>
-              <w:rPr>
-                <w:rFonts w:cs="Times New Roman" w:hint="eastAsia" w:ascii="Times New Roman" w:hAnsi="Times New Roman" w:eastAsia="標楷體"/>
-                <w:sz w:val="28"/>
+            </w:pPr>
+            <w:r>
+              <w:rPr>
+                <w:rFonts w:cs="Times New Roman" w:hint="eastAsia"/>
                 <w:lang w:eastAsia="zh-TW"/>
               </w:rPr>
               <w:t>OpenAI Codex</w:t>
             </w:r>
             <w:r>
               <w:rPr>
-                <w:rFonts w:cs="Times New Roman" w:hint="eastAsia" w:ascii="Times New Roman" w:hAnsi="Times New Roman" w:eastAsia="標楷體"/>
-                <w:sz w:val="28"/>
+                <w:rFonts w:cs="Times New Roman" w:hint="eastAsia"/>
                 <w:lang w:eastAsia="zh-TW"/>
               </w:rPr>
               <w:t>（前次文件修訂）</w:t>
@@ -2840,43 +2801,37 @@
           </w:tcPr>
           <w:p>
             <w:pPr>
-              <w:spacing w:before="0" w:after="0" w:line="240" w:lineRule="auto"/>
-              <w:ind w:leftChars="0" w:left="0" w:rightChars="0" w:right="0" w:firstLine="0" w:firstLineChars="0"/>
+              <w:ind w:leftChars="0" w:left="0" w:rightChars="0" w:right="0"/>
               <w:rPr>
                 <w:b/>
                 <w:bCs/>
                 <w:lang w:eastAsia="zh-TW"/>
               </w:rPr>
-              <w:snapToGrid w:val="0"/>
-            </w:pPr>
-            <w:r>
-              <w:rPr>
-                <w:rFonts w:cs="Times New Roman" w:hint="eastAsia" w:ascii="Times New Roman" w:hAnsi="Times New Roman" w:eastAsia="標楷體"/>
-                <w:sz w:val="28"/>
+            </w:pPr>
+            <w:r>
+              <w:rPr>
+                <w:rFonts w:cs="Times New Roman" w:hint="eastAsia"/>
                 <w:lang w:eastAsia="zh-TW"/>
               </w:rPr>
               <w:t xml:space="preserve">2026-10-03 </w:t>
             </w:r>
             <w:r>
               <w:rPr>
-                <w:rFonts w:cs="Times New Roman" w:hint="eastAsia" w:ascii="Times New Roman" w:hAnsi="Times New Roman" w:eastAsia="標楷體"/>
-                <w:sz w:val="28"/>
+                <w:rFonts w:cs="Times New Roman" w:hint="eastAsia"/>
                 <w:lang w:eastAsia="zh-TW"/>
               </w:rPr>
               <w:t>本次修訂用於完整手冊</w:t>
             </w:r>
             <w:r>
               <w:rPr>
-                <w:rFonts w:cs="Times New Roman" w:hint="eastAsia" w:ascii="Times New Roman" w:hAnsi="Times New Roman" w:eastAsia="標楷體"/>
-                <w:sz w:val="28"/>
+                <w:rFonts w:cs="Times New Roman" w:hint="eastAsia"/>
                 <w:lang w:eastAsia="zh-TW"/>
               </w:rPr>
               <w:t xml:space="preserve"> 19 </w:t>
             </w:r>
             <w:r>
               <w:rPr>
-                <w:rFonts w:cs="Times New Roman" w:hint="eastAsia" w:ascii="Times New Roman" w:hAnsi="Times New Roman" w:eastAsia="標楷體"/>
-                <w:sz w:val="28"/>
+                <w:rFonts w:cs="Times New Roman" w:hint="eastAsia"/>
                 <w:lang w:eastAsia="zh-TW"/>
               </w:rPr>
               <w:t>張相異圖表重繪、文件與程式對照、文字及測試表修正。此列僅揭露該次已知用途，不推定原作者的歷史工作，也不取代人工查核或實際驗證。</w:t>
@@ -2896,16 +2851,10 @@
           </w:tcPr>
           <w:p>
             <w:pPr>
-              <w:spacing w:before="0" w:after="0" w:line="240" w:lineRule="auto"/>
-              <w:ind w:left="0" w:right="0" w:firstLine="0" w:leftChars="0" w:rightChars="0" w:firstLineChars="0"/>
-              <w:snapToGrid w:val="0"/>
-            </w:pPr>
-            <w:r>
-              <w:rPr>
-                <w:rFonts w:ascii="Times New Roman" w:hAnsi="Times New Roman" w:eastAsia="標楷體"/>
-                <w:sz w:val="28"/>
-              </w:rPr>
-              <w:t>1章 p.7；3章 p.13；5章 p.22；6章 p.45；7章 p.47；8章 p.55；10章 p.68；11章 p.72；12章 p.75；14章 p.81</w:t>
+              <w:ind w:leftChars="0" w:left="0" w:rightChars="0" w:right="0"/>
+            </w:pPr>
+            <w:r>
+              <w:t>1章 p.7；3章 p.13；5章 p.22；6章 p.45；7章 p.47；8章 p.55；10章 p.75；11章 p.79；12章 p.82；14章 p.88</w:t>
             </w:r>
           </w:p>
         </w:tc>
@@ -2924,14 +2873,11 @@
           </w:tcPr>
           <w:p>
             <w:pPr>
-              <w:spacing w:before="0" w:after="0" w:line="240" w:lineRule="auto"/>
-              <w:ind w:leftChars="0" w:left="0" w:rightChars="0" w:right="0" w:firstLine="0" w:firstLineChars="0"/>
-              <w:snapToGrid w:val="0"/>
-            </w:pPr>
-            <w:r>
-              <w:rPr>
-                <w:rFonts w:cs="Times New Roman" w:ascii="Times New Roman" w:hAnsi="Times New Roman" w:eastAsia="標楷體"/>
-                <w:sz w:val="28"/>
+              <w:ind w:leftChars="0" w:left="0" w:rightChars="0" w:right="0"/>
+            </w:pPr>
+            <w:r>
+              <w:rPr>
+                <w:rFonts w:cs="Times New Roman"/>
               </w:rPr>
               <w:t>AI-3</w:t>
             </w:r>
@@ -2950,21 +2896,17 @@
           </w:tcPr>
           <w:p>
             <w:pPr>
-              <w:spacing w:before="0" w:after="0" w:line="240" w:lineRule="auto"/>
-              <w:ind w:leftChars="0" w:left="0" w:rightChars="0" w:right="0" w:firstLine="0" w:firstLineChars="0"/>
-              <w:snapToGrid w:val="0"/>
-            </w:pPr>
-            <w:r>
-              <w:rPr>
-                <w:rFonts w:cs="Times New Roman" w:ascii="Times New Roman" w:hAnsi="Times New Roman" w:eastAsia="標楷體"/>
-                <w:sz w:val="28"/>
+              <w:ind w:leftChars="0" w:left="0" w:rightChars="0" w:right="0"/>
+            </w:pPr>
+            <w:r>
+              <w:rPr>
+                <w:rFonts w:cs="Times New Roman"/>
               </w:rPr>
               <w:t>OpenAI Codex</w:t>
             </w:r>
             <w:r>
               <w:rPr>
-                <w:rFonts w:cs="Times New Roman" w:ascii="Times New Roman" w:hAnsi="Times New Roman" w:eastAsia="標楷體"/>
-                <w:sz w:val="28"/>
+                <w:rFonts w:cs="Times New Roman"/>
               </w:rPr>
               <w:t>（規範修訂）</w:t>
             </w:r>
@@ -2983,49 +2925,44 @@
           </w:tcPr>
           <w:p>
             <w:pPr>
-              <w:spacing w:before="0" w:after="0" w:line="240" w:lineRule="auto"/>
-              <w:ind w:leftChars="0" w:left="0" w:rightChars="0" w:right="0" w:firstLine="0" w:firstLineChars="0"/>
-              <w:snapToGrid w:val="0"/>
-            </w:pPr>
-            <w:r>
-              <w:rPr>
-                <w:rFonts w:ascii="Times New Roman" w:hAnsi="Times New Roman" w:eastAsia="標楷體"/>
-                <w:sz w:val="28"/>
+              <w:ind w:leftChars="0" w:left="0" w:rightChars="0" w:right="0"/>
+              <w:rPr>
+                <w:lang w:eastAsia="zh-TW"/>
+              </w:rPr>
+            </w:pPr>
+            <w:r>
+              <w:rPr>
+                <w:lang w:eastAsia="zh-TW"/>
               </w:rPr>
               <w:t xml:space="preserve">2026-10-04 </w:t>
             </w:r>
             <w:r>
               <w:rPr>
-                <w:rFonts w:ascii="Times New Roman" w:hAnsi="Times New Roman" w:eastAsia="標楷體"/>
-                <w:sz w:val="28"/>
+                <w:lang w:eastAsia="zh-TW"/>
               </w:rPr>
               <w:t>第一輪依公告調整格式，補狀態機、程式規格、時程、</w:t>
             </w:r>
             <w:r>
               <w:rPr>
-                <w:rFonts w:ascii="Times New Roman" w:hAnsi="Times New Roman" w:eastAsia="標楷體"/>
-                <w:sz w:val="28"/>
+                <w:lang w:eastAsia="zh-TW"/>
               </w:rPr>
               <w:t xml:space="preserve">Git </w:t>
             </w:r>
             <w:r>
               <w:rPr>
-                <w:rFonts w:ascii="Times New Roman" w:hAnsi="Times New Roman" w:eastAsia="標楷體"/>
-                <w:sz w:val="28"/>
+                <w:lang w:eastAsia="zh-TW"/>
               </w:rPr>
               <w:t>佐證說明及評審修正表架構。該輪未取得評語內容；本輪逐字稿整理另列</w:t>
             </w:r>
             <w:r>
               <w:rPr>
-                <w:rFonts w:ascii="Times New Roman" w:hAnsi="Times New Roman" w:eastAsia="標楷體"/>
-                <w:sz w:val="28"/>
+                <w:lang w:eastAsia="zh-TW"/>
               </w:rPr>
               <w:t xml:space="preserve"> AI-4</w:t>
             </w:r>
             <w:r>
               <w:rPr>
-                <w:rFonts w:ascii="Times New Roman" w:hAnsi="Times New Roman" w:eastAsia="標楷體"/>
-                <w:sz w:val="28"/>
+                <w:lang w:eastAsia="zh-TW"/>
               </w:rPr>
               <w:t>，未代填實際分工、心得或歷史週報。</w:t>
             </w:r>
@@ -3044,16 +2981,10 @@
           </w:tcPr>
           <w:p>
             <w:pPr>
-              <w:spacing w:before="0" w:after="0" w:line="240" w:lineRule="auto"/>
-              <w:ind w:left="0" w:right="0" w:firstLine="0" w:leftChars="0" w:rightChars="0" w:firstLineChars="0"/>
-              <w:snapToGrid w:val="0"/>
-            </w:pPr>
-            <w:r>
-              <w:rPr>
-                <w:rFonts w:ascii="Times New Roman" w:hAnsi="Times New Roman" w:eastAsia="標楷體"/>
-                <w:sz w:val="28"/>
-              </w:rPr>
-              <w:t>全冊格式；內容：4章 p.16；7-4 p.48；9-3 p.65；附錄A p.84</w:t>
+              <w:ind w:leftChars="0" w:left="0" w:rightChars="0" w:right="0"/>
+            </w:pPr>
+            <w:r>
+              <w:t>全冊格式；內容：4章 p.16；7-4 p.48；9-3 p.65；附錄A p.91</w:t>
             </w:r>
           </w:p>
         </w:tc>
@@ -3065,16 +2996,81 @@
           </w:tcPr>
           <w:p>
             <w:pPr>
-              <w:spacing w:before="0" w:after="0" w:line="240" w:lineRule="auto"/>
-              <w:ind w:leftChars="0" w:left="0" w:rightChars="0" w:right="0" w:firstLine="0" w:firstLineChars="0"/>
+              <w:ind w:leftChars="0" w:left="0" w:rightChars="0" w:right="0"/>
+            </w:pPr>
+            <w:r>
+              <w:t>AI-4</w:t>
+            </w:r>
+          </w:p>
+        </w:tc>
+        <w:tc>
+          <w:tcPr>
+            <w:tcW w:w="1984" w:type="dxa"/>
+          </w:tcPr>
+          <w:p>
+            <w:pPr>
+              <w:ind w:leftChars="0" w:left="0" w:rightChars="0" w:right="0"/>
+            </w:pPr>
+            <w:r>
+              <w:t>OpenAI Codex</w:t>
+            </w:r>
+            <w:r>
+              <w:t>（逐字稿整理）</w:t>
+            </w:r>
+          </w:p>
+        </w:tc>
+        <w:tc>
+          <w:tcPr>
+            <w:tcW w:w="4082" w:type="dxa"/>
+          </w:tcPr>
+          <w:p>
+            <w:pPr>
+              <w:ind w:leftChars="0" w:left="0" w:rightChars="0" w:right="0"/>
+              <w:rPr>
+                <w:lang w:eastAsia="zh-TW"/>
+              </w:rPr>
+            </w:pPr>
+            <w:r>
+              <w:rPr>
+                <w:lang w:eastAsia="zh-TW"/>
+              </w:rPr>
+              <w:t xml:space="preserve">2026-10-04 </w:t>
+            </w:r>
+            <w:r>
+              <w:rPr>
+                <w:lang w:eastAsia="zh-TW"/>
+              </w:rPr>
+              <w:t>依使用者提供的語音轉文字，整理可辨識的提問／建議，修訂動機、需求與比較／驗證／展示規劃。節錄保留原詞，歸納與不明片段另註；沒有原始音檔，不宣稱還原正式評語或完成實測。</w:t>
+            </w:r>
+          </w:p>
+        </w:tc>
+        <w:tc>
+          <w:tcPr>
+            <w:tcW w:w="3118" w:type="dxa"/>
+          </w:tcPr>
+          <w:p>
+            <w:pPr>
+              <w:ind w:leftChars="0" w:left="0" w:rightChars="0" w:right="0"/>
+            </w:pPr>
+            <w:r>
+              <w:t>1-2 p.7；3-4 p.15；4-2 p.17；5-1 p.22；第6章 p.45；10-3 p.78；12-3 p.85；附錄A p.91</w:t>
+            </w:r>
+          </w:p>
+        </w:tc>
+      </w:tr>
+      <w:tr>
+        <w:tc>
+          <w:tcPr>
+            <w:tcW w:w="907" w:type="dxa"/>
+          </w:tcPr>
+          <w:p>
+            <w:pPr>
               <w:snapToGrid w:val="0"/>
-            </w:pPr>
-            <w:r>
-              <w:rPr>
-                <w:rFonts w:ascii="Times New Roman" w:hAnsi="Times New Roman" w:eastAsia="標楷體"/>
-                <w:sz w:val="28"/>
-              </w:rPr>
-              <w:t>AI-4</w:t>
+              <w:spacing w:after="80"/>
+              <w:ind w:leftChars="0" w:left="0" w:rightChars="0" w:right="0"/>
+            </w:pPr>
+            <w:r>
+              <w:t>AI-5</w:t>
             </w:r>
           </w:p>
         </w:tc>
@@ -3084,23 +3080,15 @@
           </w:tcPr>
           <w:p>
             <w:pPr>
-              <w:spacing w:before="0" w:after="0" w:line="240" w:lineRule="auto"/>
-              <w:ind w:leftChars="0" w:left="0" w:rightChars="0" w:right="0" w:firstLine="0" w:firstLineChars="0"/>
               <w:snapToGrid w:val="0"/>
-            </w:pPr>
-            <w:r>
-              <w:rPr>
-                <w:rFonts w:ascii="Times New Roman" w:hAnsi="Times New Roman" w:eastAsia="標楷體"/>
-                <w:sz w:val="28"/>
-              </w:rPr>
+              <w:spacing w:after="80"/>
+              <w:ind w:leftChars="0" w:left="0" w:rightChars="0" w:right="0"/>
+            </w:pPr>
+            <w:r>
               <w:t>OpenAI Codex</w:t>
             </w:r>
             <w:r>
-              <w:rPr>
-                <w:rFonts w:ascii="Times New Roman" w:hAnsi="Times New Roman" w:eastAsia="標楷體"/>
-                <w:sz w:val="28"/>
-              </w:rPr>
-              <w:t>（逐字稿整理）</w:t>
+              <w:t>（程式圖片整理）</w:t>
             </w:r>
           </w:p>
         </w:tc>
@@ -3110,23 +3098,21 @@
           </w:tcPr>
           <w:p>
             <w:pPr>
-              <w:spacing w:before="0" w:after="0" w:line="240" w:lineRule="auto"/>
-              <w:ind w:leftChars="0" w:left="0" w:rightChars="0" w:right="0" w:firstLine="0" w:firstLineChars="0"/>
               <w:snapToGrid w:val="0"/>
-            </w:pPr>
-            <w:r>
-              <w:rPr>
-                <w:rFonts w:ascii="Times New Roman" w:hAnsi="Times New Roman" w:eastAsia="標楷體"/>
-                <w:sz w:val="28"/>
-              </w:rPr>
-              <w:t xml:space="preserve">2026-10-04 </w:t>
-            </w:r>
-            <w:r>
-              <w:rPr>
-                <w:rFonts w:ascii="Times New Roman" w:hAnsi="Times New Roman" w:eastAsia="標楷體"/>
-                <w:sz w:val="28"/>
-              </w:rPr>
-              <w:t>依使用者提供的語音轉文字，整理可辨識的提問／建議，修訂動機、需求與比較／驗證／展示規劃。節錄保留原詞，歸納與不明片段另註；沒有原始音檔，不宣稱還原正式評語或完成實測。</w:t>
+              <w:spacing w:after="80"/>
+              <w:ind w:leftChars="0" w:left="0" w:rightChars="0" w:right="0"/>
+            </w:pPr>
+            <w:r>
+              <w:t xml:space="preserve">2026-10-06 </w:t>
+            </w:r>
+            <w:r>
+              <w:t>依目前程式原文擷取第</w:t>
+            </w:r>
+            <w:r>
+              <w:t xml:space="preserve"> 9 </w:t>
+            </w:r>
+            <w:r>
+              <w:t>章十個重點片段，製成附檔名、行號與版本的圖片，並調整圖說、分頁及交叉引用。未改寫截錄程式、未新增功能，也未以圖片表示執行或驗收成功。</w:t>
             </w:r>
           </w:p>
         </w:tc>
@@ -3136,16 +3122,12 @@
           </w:tcPr>
           <w:p>
             <w:pPr>
-              <w:spacing w:before="0" w:after="0" w:line="240" w:lineRule="auto"/>
-              <w:ind w:left="0" w:right="0" w:firstLine="0" w:leftChars="0" w:rightChars="0" w:firstLineChars="0"/>
               <w:snapToGrid w:val="0"/>
-            </w:pPr>
-            <w:r>
-              <w:rPr>
-                <w:rFonts w:ascii="Times New Roman" w:hAnsi="Times New Roman" w:eastAsia="標楷體"/>
-                <w:sz w:val="28"/>
-              </w:rPr>
-              <w:t>1-2 p.7；3-4 p.15；4-2 p.17；5-1 p.22；第6章 p.45；10-3 p.71；12-3 p.78；附錄A p.84</w:t>
+              <w:spacing w:after="80"/>
+              <w:ind w:leftChars="0" w:left="0" w:rightChars="0" w:right="0"/>
+            </w:pPr>
+            <w:r>
+              <w:t>第9章 p.64；圖 9-3-1 至 9-3-10</w:t>
             </w:r>
           </w:p>
         </w:tc>

</xml_diff>

<commit_message>
docs: sync reference sheet after removing AI-4 usage disclosure
</commit_message>
<xml_diff>
--- a/documents/參考資料.docx
+++ b/documents/參考資料.docx
@@ -2952,19 +2952,7 @@
               <w:rPr>
                 <w:lang w:eastAsia="zh-TW"/>
               </w:rPr>
-              <w:t>佐證說明及評審修正表架構。該輪未取得評語內容；本輪逐字稿整理另列</w:t>
-            </w:r>
-            <w:r>
-              <w:rPr>
-                <w:lang w:eastAsia="zh-TW"/>
-              </w:rPr>
-              <w:t xml:space="preserve"> AI-4</w:t>
-            </w:r>
-            <w:r>
-              <w:rPr>
-                <w:lang w:eastAsia="zh-TW"/>
-              </w:rPr>
-              <w:t>，未代填實際分工、心得或歷史週報。</w:t>
+              <w:t>佐證說明及評審修正表架構。該輪未取得評語內容；未代填實際分工、心得或歷史週報。</w:t>
             </w:r>
           </w:p>
         </w:tc>
@@ -2984,76 +2972,11 @@
               <w:ind w:leftChars="0" w:left="0" w:rightChars="0" w:right="0"/>
             </w:pPr>
             <w:r>
+              <w:rPr>
+                <w:rFonts w:cs="Times New Roman"/>
+                <w:lang w:eastAsia="zh-TW"/>
+              </w:rPr>
               <w:t>全冊格式；內容：4章 p.16；7-4 p.48；9-3 p.65；附錄A p.91</w:t>
-            </w:r>
-          </w:p>
-        </w:tc>
-      </w:tr>
-      <w:tr>
-        <w:tc>
-          <w:tcPr>
-            <w:tcW w:w="907" w:type="dxa"/>
-          </w:tcPr>
-          <w:p>
-            <w:pPr>
-              <w:ind w:leftChars="0" w:left="0" w:rightChars="0" w:right="0"/>
-            </w:pPr>
-            <w:r>
-              <w:t>AI-4</w:t>
-            </w:r>
-          </w:p>
-        </w:tc>
-        <w:tc>
-          <w:tcPr>
-            <w:tcW w:w="1984" w:type="dxa"/>
-          </w:tcPr>
-          <w:p>
-            <w:pPr>
-              <w:ind w:leftChars="0" w:left="0" w:rightChars="0" w:right="0"/>
-            </w:pPr>
-            <w:r>
-              <w:t>OpenAI Codex</w:t>
-            </w:r>
-            <w:r>
-              <w:t>（逐字稿整理）</w:t>
-            </w:r>
-          </w:p>
-        </w:tc>
-        <w:tc>
-          <w:tcPr>
-            <w:tcW w:w="4082" w:type="dxa"/>
-          </w:tcPr>
-          <w:p>
-            <w:pPr>
-              <w:ind w:leftChars="0" w:left="0" w:rightChars="0" w:right="0"/>
-              <w:rPr>
-                <w:lang w:eastAsia="zh-TW"/>
-              </w:rPr>
-            </w:pPr>
-            <w:r>
-              <w:rPr>
-                <w:lang w:eastAsia="zh-TW"/>
-              </w:rPr>
-              <w:t xml:space="preserve">2026-10-04 </w:t>
-            </w:r>
-            <w:r>
-              <w:rPr>
-                <w:lang w:eastAsia="zh-TW"/>
-              </w:rPr>
-              <w:t>依使用者提供的語音轉文字，整理可辨識的提問／建議，修訂動機、需求與比較／驗證／展示規劃。節錄保留原詞，歸納與不明片段另註；沒有原始音檔，不宣稱還原正式評語或完成實測。</w:t>
-            </w:r>
-          </w:p>
-        </w:tc>
-        <w:tc>
-          <w:tcPr>
-            <w:tcW w:w="3118" w:type="dxa"/>
-          </w:tcPr>
-          <w:p>
-            <w:pPr>
-              <w:ind w:leftChars="0" w:left="0" w:rightChars="0" w:right="0"/>
-            </w:pPr>
-            <w:r>
-              <w:t>1-2 p.7；3-4 p.15；4-2 p.17；5-1 p.22；第6章 p.45；10-3 p.78；12-3 p.85；附錄A p.91</w:t>
             </w:r>
           </w:p>
         </w:tc>
@@ -3088,7 +3011,7 @@
               <w:t>OpenAI Codex</w:t>
             </w:r>
             <w:r>
-              <w:t>（程式圖片整理）</w:t>
+              <w:t>（程式截圖整理）</w:t>
             </w:r>
           </w:p>
         </w:tc>
@@ -3106,13 +3029,19 @@
               <w:t xml:space="preserve">2026-10-06 </w:t>
             </w:r>
             <w:r>
-              <w:t>依目前程式原文擷取第</w:t>
+              <w:t>協助在</w:t>
+            </w:r>
+            <w:r>
+              <w:t xml:space="preserve"> VS Code </w:t>
+            </w:r>
+            <w:r>
+              <w:t>開啟專案原始程式檔，將第</w:t>
             </w:r>
             <w:r>
               <w:t xml:space="preserve"> 9 </w:t>
             </w:r>
             <w:r>
-              <w:t>章十個重點片段，製成附檔名、行號與版本的圖片，並調整圖說、分頁及交叉引用。未改寫截錄程式、未新增功能，也未以圖片表示執行或驗收成功。</w:t>
+              <w:t>章十張程式圖片改為實際編輯器畫面截圖，並調整圖說、分頁及交叉引用。未改寫程式、未新增功能，也未以截圖表示執行或驗收成功。</w:t>
             </w:r>
           </w:p>
         </w:tc>

</xml_diff>